<commit_message>
Update Integrated CA2_DVT_MLB - Final.docx
Added the results from baskets for the last part of the CA.
</commit_message>
<xml_diff>
--- a/Integrated CA2_DVT_MLB - Final.docx
+++ b/Integrated CA2_DVT_MLB - Final.docx
@@ -1142,15 +1142,7 @@
           <w:sz w:val="24"/>
           <w:szCs w:val="24"/>
         </w:rPr>
-        <w:t>-Instacart</w:t>
-      </w:r>
-      <w:r>
-        <w:rPr>
-          <w:rFonts w:ascii="Times New Roman" w:hAnsi="Times New Roman" w:cs="Times New Roman"/>
-          <w:sz w:val="24"/>
-          <w:szCs w:val="24"/>
-        </w:rPr>
-        <w:t xml:space="preserve"> dataset used in this project is particularly relevant. As described by the dataset creators, “Instacart is an online same-day grocery delivery service, where users order groceries through a web application. This dataset </w:t>
+        <w:t xml:space="preserve">-Instacart dataset used in this project is particularly relevant. As described by the dataset creators, “Instacart is an online same-day grocery delivery service, where users order groceries through a web application. This dataset </w:t>
       </w:r>
       <w:r>
         <w:rPr>
@@ -1620,6 +1612,1449 @@
     <w:p>
       <w:pPr>
         <w:pStyle w:val="ListParagraph"/>
+        <w:spacing w:before="240"/>
+        <w:jc w:val="both"/>
+        <w:rPr>
+          <w:rFonts w:ascii="Times New Roman" w:hAnsi="Times New Roman" w:cs="Times New Roman"/>
+          <w:sz w:val="24"/>
+          <w:szCs w:val="24"/>
+          <w:lang w:val="en-IE"/>
+        </w:rPr>
+      </w:pPr>
+      <w:r>
+        <w:rPr>
+          <w:rFonts w:ascii="Times New Roman" w:hAnsi="Times New Roman" w:cs="Times New Roman"/>
+          <w:sz w:val="24"/>
+          <w:szCs w:val="24"/>
+          <w:lang w:val="en-IE"/>
+        </w:rPr>
+        <w:t>SUCCESS! Loaded 806,660 shopping baskets</w:t>
+      </w:r>
+    </w:p>
+    <w:p>
+      <w:pPr>
+        <w:pStyle w:val="ListParagraph"/>
+        <w:spacing w:before="240"/>
+        <w:jc w:val="both"/>
+        <w:rPr>
+          <w:rFonts w:ascii="Times New Roman" w:hAnsi="Times New Roman" w:cs="Times New Roman"/>
+          <w:sz w:val="24"/>
+          <w:szCs w:val="24"/>
+          <w:lang w:val="en-IE"/>
+        </w:rPr>
+      </w:pPr>
+      <w:r>
+        <w:rPr>
+          <w:rFonts w:ascii="Times New Roman" w:hAnsi="Times New Roman" w:cs="Times New Roman"/>
+          <w:sz w:val="24"/>
+          <w:szCs w:val="24"/>
+          <w:lang w:val="en-IE"/>
+        </w:rPr>
+        <w:t>Example basket:</w:t>
+      </w:r>
+    </w:p>
+    <w:p>
+      <w:pPr>
+        <w:pStyle w:val="ListParagraph"/>
+        <w:spacing w:before="240"/>
+        <w:jc w:val="both"/>
+        <w:rPr>
+          <w:rFonts w:ascii="Times New Roman" w:hAnsi="Times New Roman" w:cs="Times New Roman"/>
+          <w:sz w:val="24"/>
+          <w:szCs w:val="24"/>
+          <w:lang w:val="en-IE"/>
+        </w:rPr>
+      </w:pPr>
+      <w:r>
+        <w:rPr>
+          <w:rFonts w:ascii="Times New Roman" w:hAnsi="Times New Roman" w:cs="Times New Roman"/>
+          <w:sz w:val="24"/>
+          <w:szCs w:val="24"/>
+          <w:lang w:val="en-IE"/>
+        </w:rPr>
+        <w:t>['Michigan Organic Kale', 'Peppermint Stick Ice Cream', 'Italian Dry Salame', 'Organic Raspberry Fruit Spread', 'Dairy Free Gluten Free Mushroom &amp; Roasted Garlic Pizza']</w:t>
+      </w:r>
+    </w:p>
+    <w:p>
+      <w:pPr>
+        <w:pStyle w:val="ListParagraph"/>
+        <w:spacing w:before="240"/>
+        <w:jc w:val="both"/>
+        <w:rPr>
+          <w:rFonts w:ascii="Times New Roman" w:hAnsi="Times New Roman" w:cs="Times New Roman"/>
+          <w:sz w:val="24"/>
+          <w:szCs w:val="24"/>
+          <w:lang w:val="en-IE"/>
+        </w:rPr>
+      </w:pPr>
+    </w:p>
+    <w:p>
+      <w:pPr>
+        <w:pStyle w:val="ListParagraph"/>
+        <w:spacing w:before="240"/>
+        <w:jc w:val="both"/>
+        <w:rPr>
+          <w:rFonts w:ascii="Times New Roman" w:hAnsi="Times New Roman" w:cs="Times New Roman"/>
+          <w:sz w:val="24"/>
+          <w:szCs w:val="24"/>
+          <w:lang w:val="en-IE"/>
+        </w:rPr>
+      </w:pPr>
+      <w:r>
+        <w:rPr>
+          <w:rFonts w:ascii="Times New Roman" w:hAnsi="Times New Roman" w:cs="Times New Roman"/>
+          <w:sz w:val="24"/>
+          <w:szCs w:val="24"/>
+          <w:lang w:val="en-IE"/>
+        </w:rPr>
+        <w:t>First 5 rows:</w:t>
+      </w:r>
+    </w:p>
+    <w:p>
+      <w:pPr>
+        <w:pStyle w:val="ListParagraph"/>
+        <w:numPr>
+          <w:ilvl w:val="0"/>
+          <w:numId w:val="13"/>
+        </w:numPr>
+        <w:spacing w:before="240"/>
+        <w:jc w:val="both"/>
+        <w:rPr>
+          <w:rFonts w:ascii="Times New Roman" w:hAnsi="Times New Roman" w:cs="Times New Roman"/>
+          <w:sz w:val="24"/>
+          <w:szCs w:val="24"/>
+          <w:lang w:val="en-IE"/>
+        </w:rPr>
+      </w:pPr>
+      <w:proofErr w:type="spellStart"/>
+      <w:r>
+        <w:rPr>
+          <w:rFonts w:ascii="Times New Roman" w:hAnsi="Times New Roman" w:cs="Times New Roman"/>
+          <w:sz w:val="24"/>
+          <w:szCs w:val="24"/>
+          <w:lang w:val="en-IE"/>
+        </w:rPr>
+        <w:t>basket_id</w:t>
+      </w:r>
+      <w:proofErr w:type="spellEnd"/>
+      <w:r>
+        <w:rPr>
+          <w:rFonts w:ascii="Times New Roman" w:hAnsi="Times New Roman" w:cs="Times New Roman"/>
+          <w:sz w:val="24"/>
+          <w:szCs w:val="24"/>
+          <w:lang w:val="en-IE"/>
+        </w:rPr>
+        <w:t xml:space="preserve">                                             basket</w:t>
+      </w:r>
+    </w:p>
+    <w:p>
+      <w:pPr>
+        <w:pStyle w:val="ListParagraph"/>
+        <w:numPr>
+          <w:ilvl w:val="0"/>
+          <w:numId w:val="13"/>
+        </w:numPr>
+        <w:spacing w:before="240"/>
+        <w:jc w:val="both"/>
+        <w:rPr>
+          <w:rFonts w:ascii="Times New Roman" w:hAnsi="Times New Roman" w:cs="Times New Roman"/>
+          <w:sz w:val="24"/>
+          <w:szCs w:val="24"/>
+          <w:lang w:val="en-IE"/>
+        </w:rPr>
+      </w:pPr>
+      <w:proofErr w:type="gramStart"/>
+      <w:r>
+        <w:rPr>
+          <w:rFonts w:ascii="Times New Roman" w:hAnsi="Times New Roman" w:cs="Times New Roman"/>
+          <w:sz w:val="24"/>
+          <w:szCs w:val="24"/>
+          <w:lang w:val="en-IE"/>
+        </w:rPr>
+        <w:t>0  [</w:t>
+      </w:r>
+      <w:proofErr w:type="gramEnd"/>
+      <w:r>
+        <w:rPr>
+          <w:rFonts w:ascii="Times New Roman" w:hAnsi="Times New Roman" w:cs="Times New Roman"/>
+          <w:sz w:val="24"/>
+          <w:szCs w:val="24"/>
+          <w:lang w:val="en-IE"/>
+        </w:rPr>
+        <w:t>Michigan Organic Kale, Peppermint Stick Ice C...</w:t>
+      </w:r>
+    </w:p>
+    <w:p>
+      <w:pPr>
+        <w:pStyle w:val="ListParagraph"/>
+        <w:numPr>
+          <w:ilvl w:val="0"/>
+          <w:numId w:val="13"/>
+        </w:numPr>
+        <w:spacing w:before="240"/>
+        <w:jc w:val="both"/>
+        <w:rPr>
+          <w:rFonts w:ascii="Times New Roman" w:hAnsi="Times New Roman" w:cs="Times New Roman"/>
+          <w:sz w:val="24"/>
+          <w:szCs w:val="24"/>
+          <w:lang w:val="en-IE"/>
+        </w:rPr>
+      </w:pPr>
+      <w:r>
+        <w:rPr>
+          <w:rFonts w:ascii="Times New Roman" w:hAnsi="Times New Roman" w:cs="Times New Roman"/>
+          <w:sz w:val="24"/>
+          <w:szCs w:val="24"/>
+          <w:lang w:val="en-IE"/>
+        </w:rPr>
+        <w:t xml:space="preserve">1          1             </w:t>
+      </w:r>
+      <w:proofErr w:type="gramStart"/>
+      <w:r>
+        <w:rPr>
+          <w:rFonts w:ascii="Times New Roman" w:hAnsi="Times New Roman" w:cs="Times New Roman"/>
+          <w:sz w:val="24"/>
+          <w:szCs w:val="24"/>
+          <w:lang w:val="en-IE"/>
+        </w:rPr>
+        <w:t xml:space="preserve">   [</w:t>
+      </w:r>
+      <w:proofErr w:type="gramEnd"/>
+      <w:r>
+        <w:rPr>
+          <w:rFonts w:ascii="Times New Roman" w:hAnsi="Times New Roman" w:cs="Times New Roman"/>
+          <w:sz w:val="24"/>
+          <w:szCs w:val="24"/>
+          <w:lang w:val="en-IE"/>
+        </w:rPr>
+        <w:t xml:space="preserve">Cage </w:t>
+      </w:r>
+      <w:proofErr w:type="gramStart"/>
+      <w:r>
+        <w:rPr>
+          <w:rFonts w:ascii="Times New Roman" w:hAnsi="Times New Roman" w:cs="Times New Roman"/>
+          <w:sz w:val="24"/>
+          <w:szCs w:val="24"/>
+          <w:lang w:val="en-IE"/>
+        </w:rPr>
+        <w:t>Free  100</w:t>
+      </w:r>
+      <w:proofErr w:type="gramEnd"/>
+      <w:r>
+        <w:rPr>
+          <w:rFonts w:ascii="Times New Roman" w:hAnsi="Times New Roman" w:cs="Times New Roman"/>
+          <w:sz w:val="24"/>
+          <w:szCs w:val="24"/>
+          <w:lang w:val="en-IE"/>
+        </w:rPr>
+        <w:t>% Liquid Egg Whites]</w:t>
+      </w:r>
+    </w:p>
+    <w:p>
+      <w:pPr>
+        <w:pStyle w:val="ListParagraph"/>
+        <w:numPr>
+          <w:ilvl w:val="0"/>
+          <w:numId w:val="13"/>
+        </w:numPr>
+        <w:spacing w:before="240"/>
+        <w:jc w:val="both"/>
+        <w:rPr>
+          <w:rFonts w:ascii="Times New Roman" w:hAnsi="Times New Roman" w:cs="Times New Roman"/>
+          <w:sz w:val="24"/>
+          <w:szCs w:val="24"/>
+          <w:lang w:val="en-IE"/>
+        </w:rPr>
+      </w:pPr>
+      <w:proofErr w:type="gramStart"/>
+      <w:r>
+        <w:rPr>
+          <w:rFonts w:ascii="Times New Roman" w:hAnsi="Times New Roman" w:cs="Times New Roman"/>
+          <w:sz w:val="24"/>
+          <w:szCs w:val="24"/>
+          <w:lang w:val="en-IE"/>
+        </w:rPr>
+        <w:t>2  [</w:t>
+      </w:r>
+      <w:proofErr w:type="gramEnd"/>
+      <w:r>
+        <w:rPr>
+          <w:rFonts w:ascii="Times New Roman" w:hAnsi="Times New Roman" w:cs="Times New Roman"/>
+          <w:sz w:val="24"/>
+          <w:szCs w:val="24"/>
+          <w:lang w:val="en-IE"/>
+        </w:rPr>
+        <w:t>Mild Diced Green Chiles, Organic Tortilla Chi...</w:t>
+      </w:r>
+    </w:p>
+    <w:p>
+      <w:pPr>
+        <w:pStyle w:val="ListParagraph"/>
+        <w:numPr>
+          <w:ilvl w:val="0"/>
+          <w:numId w:val="13"/>
+        </w:numPr>
+        <w:spacing w:before="240"/>
+        <w:jc w:val="both"/>
+        <w:rPr>
+          <w:rFonts w:ascii="Times New Roman" w:hAnsi="Times New Roman" w:cs="Times New Roman"/>
+          <w:sz w:val="24"/>
+          <w:szCs w:val="24"/>
+          <w:lang w:val="en-IE"/>
+        </w:rPr>
+      </w:pPr>
+      <w:proofErr w:type="gramStart"/>
+      <w:r>
+        <w:rPr>
+          <w:rFonts w:ascii="Times New Roman" w:hAnsi="Times New Roman" w:cs="Times New Roman"/>
+          <w:sz w:val="24"/>
+          <w:szCs w:val="24"/>
+          <w:lang w:val="en-IE"/>
+        </w:rPr>
+        <w:t>3  [</w:t>
+      </w:r>
+      <w:proofErr w:type="gramEnd"/>
+      <w:r>
+        <w:rPr>
+          <w:rFonts w:ascii="Times New Roman" w:hAnsi="Times New Roman" w:cs="Times New Roman"/>
+          <w:sz w:val="24"/>
+          <w:szCs w:val="24"/>
+          <w:lang w:val="en-IE"/>
+        </w:rPr>
+        <w:t>Organic Whole Strawberries, Organic Hot Salsa...</w:t>
+      </w:r>
+    </w:p>
+    <w:p>
+      <w:pPr>
+        <w:pStyle w:val="ListParagraph"/>
+        <w:numPr>
+          <w:ilvl w:val="0"/>
+          <w:numId w:val="13"/>
+        </w:numPr>
+        <w:spacing w:before="240"/>
+        <w:jc w:val="both"/>
+        <w:rPr>
+          <w:rFonts w:ascii="Times New Roman" w:hAnsi="Times New Roman" w:cs="Times New Roman"/>
+          <w:sz w:val="24"/>
+          <w:szCs w:val="24"/>
+          <w:lang w:val="en-IE"/>
+        </w:rPr>
+      </w:pPr>
+      <w:proofErr w:type="gramStart"/>
+      <w:r>
+        <w:rPr>
+          <w:rFonts w:ascii="Times New Roman" w:hAnsi="Times New Roman" w:cs="Times New Roman"/>
+          <w:sz w:val="24"/>
+          <w:szCs w:val="24"/>
+          <w:lang w:val="en-IE"/>
+        </w:rPr>
+        <w:t>4  [</w:t>
+      </w:r>
+      <w:proofErr w:type="gramEnd"/>
+      <w:r>
+        <w:rPr>
+          <w:rFonts w:ascii="Times New Roman" w:hAnsi="Times New Roman" w:cs="Times New Roman"/>
+          <w:sz w:val="24"/>
+          <w:szCs w:val="24"/>
+          <w:lang w:val="en-IE"/>
+        </w:rPr>
+        <w:t>Chicken &amp; vegetable dumplings with rice in an...</w:t>
+      </w:r>
+    </w:p>
+    <w:p>
+      <w:pPr>
+        <w:pStyle w:val="ListParagraph"/>
+        <w:spacing w:before="240"/>
+        <w:jc w:val="both"/>
+        <w:rPr>
+          <w:rFonts w:ascii="Times New Roman" w:hAnsi="Times New Roman" w:cs="Times New Roman"/>
+          <w:sz w:val="24"/>
+          <w:szCs w:val="24"/>
+          <w:lang w:val="en-IE"/>
+        </w:rPr>
+      </w:pPr>
+    </w:p>
+    <w:p>
+      <w:pPr>
+        <w:pStyle w:val="ListParagraph"/>
+        <w:spacing w:before="240"/>
+        <w:jc w:val="both"/>
+        <w:rPr>
+          <w:rFonts w:ascii="Times New Roman" w:hAnsi="Times New Roman" w:cs="Times New Roman"/>
+          <w:sz w:val="24"/>
+          <w:szCs w:val="24"/>
+          <w:lang w:val="en-IE"/>
+        </w:rPr>
+      </w:pPr>
+    </w:p>
+    <w:p>
+      <w:pPr>
+        <w:pStyle w:val="ListParagraph"/>
+        <w:spacing w:before="240"/>
+        <w:jc w:val="both"/>
+        <w:rPr>
+          <w:rFonts w:ascii="Times New Roman" w:hAnsi="Times New Roman" w:cs="Times New Roman"/>
+          <w:sz w:val="24"/>
+          <w:szCs w:val="24"/>
+          <w:lang w:val="en-IE"/>
+        </w:rPr>
+      </w:pPr>
+      <w:r>
+        <w:rPr>
+          <w:rFonts w:ascii="Times New Roman" w:hAnsi="Times New Roman" w:cs="Times New Roman"/>
+          <w:sz w:val="24"/>
+          <w:szCs w:val="24"/>
+          <w:lang w:val="en-IE"/>
+        </w:rPr>
+        <w:t>To optimise tech capabilities due to large dataset: long format – one row per product purchased was set up:</w:t>
+      </w:r>
+    </w:p>
+    <w:p>
+      <w:pPr>
+        <w:pStyle w:val="ListParagraph"/>
+        <w:spacing w:before="240"/>
+        <w:jc w:val="both"/>
+        <w:rPr>
+          <w:rFonts w:ascii="Times New Roman" w:hAnsi="Times New Roman" w:cs="Times New Roman"/>
+          <w:sz w:val="24"/>
+          <w:szCs w:val="24"/>
+          <w:lang w:val="en-IE"/>
+        </w:rPr>
+      </w:pPr>
+    </w:p>
+    <w:p>
+      <w:pPr>
+        <w:pStyle w:val="ListParagraph"/>
+        <w:numPr>
+          <w:ilvl w:val="0"/>
+          <w:numId w:val="14"/>
+        </w:numPr>
+        <w:spacing w:before="240"/>
+        <w:jc w:val="both"/>
+        <w:rPr>
+          <w:rFonts w:ascii="Times New Roman" w:hAnsi="Times New Roman" w:cs="Times New Roman"/>
+          <w:sz w:val="24"/>
+          <w:szCs w:val="24"/>
+          <w:lang w:val="en-IE"/>
+        </w:rPr>
+      </w:pPr>
+      <w:proofErr w:type="spellStart"/>
+      <w:r>
+        <w:rPr>
+          <w:rFonts w:ascii="Times New Roman" w:hAnsi="Times New Roman" w:cs="Times New Roman"/>
+          <w:sz w:val="24"/>
+          <w:szCs w:val="24"/>
+          <w:lang w:val="en-IE"/>
+        </w:rPr>
+        <w:t>basket_id</w:t>
+      </w:r>
+      <w:proofErr w:type="spellEnd"/>
+      <w:r>
+        <w:rPr>
+          <w:rFonts w:ascii="Times New Roman" w:hAnsi="Times New Roman" w:cs="Times New Roman"/>
+          <w:sz w:val="24"/>
+          <w:szCs w:val="24"/>
+          <w:lang w:val="en-IE"/>
+        </w:rPr>
+        <w:t xml:space="preserve">                                            product</w:t>
+      </w:r>
+    </w:p>
+    <w:p>
+      <w:pPr>
+        <w:pStyle w:val="ListParagraph"/>
+        <w:numPr>
+          <w:ilvl w:val="0"/>
+          <w:numId w:val="14"/>
+        </w:numPr>
+        <w:spacing w:before="240"/>
+        <w:jc w:val="both"/>
+        <w:rPr>
+          <w:rFonts w:ascii="Times New Roman" w:hAnsi="Times New Roman" w:cs="Times New Roman"/>
+          <w:sz w:val="24"/>
+          <w:szCs w:val="24"/>
+          <w:lang w:val="en-IE"/>
+        </w:rPr>
+      </w:pPr>
+      <w:r>
+        <w:rPr>
+          <w:rFonts w:ascii="Times New Roman" w:hAnsi="Times New Roman" w:cs="Times New Roman"/>
+          <w:sz w:val="24"/>
+          <w:szCs w:val="24"/>
+          <w:lang w:val="en-IE"/>
+        </w:rPr>
+        <w:t>0          0                              Michigan Organic Kale</w:t>
+      </w:r>
+    </w:p>
+    <w:p>
+      <w:pPr>
+        <w:pStyle w:val="ListParagraph"/>
+        <w:numPr>
+          <w:ilvl w:val="0"/>
+          <w:numId w:val="14"/>
+        </w:numPr>
+        <w:spacing w:before="240"/>
+        <w:jc w:val="both"/>
+        <w:rPr>
+          <w:rFonts w:ascii="Times New Roman" w:hAnsi="Times New Roman" w:cs="Times New Roman"/>
+          <w:sz w:val="24"/>
+          <w:szCs w:val="24"/>
+          <w:lang w:val="en-IE"/>
+        </w:rPr>
+      </w:pPr>
+      <w:r>
+        <w:rPr>
+          <w:rFonts w:ascii="Times New Roman" w:hAnsi="Times New Roman" w:cs="Times New Roman"/>
+          <w:sz w:val="24"/>
+          <w:szCs w:val="24"/>
+          <w:lang w:val="en-IE"/>
+        </w:rPr>
+        <w:t>1          0                         Peppermint Stick Ice Cream</w:t>
+      </w:r>
+    </w:p>
+    <w:p>
+      <w:pPr>
+        <w:pStyle w:val="ListParagraph"/>
+        <w:numPr>
+          <w:ilvl w:val="0"/>
+          <w:numId w:val="14"/>
+        </w:numPr>
+        <w:spacing w:before="240"/>
+        <w:jc w:val="both"/>
+        <w:rPr>
+          <w:rFonts w:ascii="Times New Roman" w:hAnsi="Times New Roman" w:cs="Times New Roman"/>
+          <w:sz w:val="24"/>
+          <w:szCs w:val="24"/>
+          <w:lang w:val="en-IE"/>
+        </w:rPr>
+      </w:pPr>
+      <w:r>
+        <w:rPr>
+          <w:rFonts w:ascii="Times New Roman" w:hAnsi="Times New Roman" w:cs="Times New Roman"/>
+          <w:sz w:val="24"/>
+          <w:szCs w:val="24"/>
+          <w:lang w:val="en-IE"/>
+        </w:rPr>
+        <w:t>2          0                                 Italian Dry Salame</w:t>
+      </w:r>
+    </w:p>
+    <w:p>
+      <w:pPr>
+        <w:pStyle w:val="ListParagraph"/>
+        <w:numPr>
+          <w:ilvl w:val="0"/>
+          <w:numId w:val="14"/>
+        </w:numPr>
+        <w:spacing w:before="240"/>
+        <w:jc w:val="both"/>
+        <w:rPr>
+          <w:rFonts w:ascii="Times New Roman" w:hAnsi="Times New Roman" w:cs="Times New Roman"/>
+          <w:sz w:val="24"/>
+          <w:szCs w:val="24"/>
+          <w:lang w:val="en-IE"/>
+        </w:rPr>
+      </w:pPr>
+      <w:r>
+        <w:rPr>
+          <w:rFonts w:ascii="Times New Roman" w:hAnsi="Times New Roman" w:cs="Times New Roman"/>
+          <w:sz w:val="24"/>
+          <w:szCs w:val="24"/>
+          <w:lang w:val="en-IE"/>
+        </w:rPr>
+        <w:t>3          0                     Organic Raspberry Fruit Spread</w:t>
+      </w:r>
+    </w:p>
+    <w:p>
+      <w:pPr>
+        <w:pStyle w:val="ListParagraph"/>
+        <w:numPr>
+          <w:ilvl w:val="0"/>
+          <w:numId w:val="14"/>
+        </w:numPr>
+        <w:spacing w:before="240"/>
+        <w:jc w:val="both"/>
+        <w:rPr>
+          <w:rFonts w:ascii="Times New Roman" w:hAnsi="Times New Roman" w:cs="Times New Roman"/>
+          <w:sz w:val="24"/>
+          <w:szCs w:val="24"/>
+          <w:lang w:val="en-IE"/>
+        </w:rPr>
+      </w:pPr>
+      <w:r>
+        <w:rPr>
+          <w:rFonts w:ascii="Times New Roman" w:hAnsi="Times New Roman" w:cs="Times New Roman"/>
+          <w:sz w:val="24"/>
+          <w:szCs w:val="24"/>
+          <w:lang w:val="en-IE"/>
+        </w:rPr>
+        <w:t xml:space="preserve">4          </w:t>
+      </w:r>
+      <w:proofErr w:type="gramStart"/>
+      <w:r>
+        <w:rPr>
+          <w:rFonts w:ascii="Times New Roman" w:hAnsi="Times New Roman" w:cs="Times New Roman"/>
+          <w:sz w:val="24"/>
+          <w:szCs w:val="24"/>
+          <w:lang w:val="en-IE"/>
+        </w:rPr>
+        <w:t>0  Dairy</w:t>
+      </w:r>
+      <w:proofErr w:type="gramEnd"/>
+      <w:r>
+        <w:rPr>
+          <w:rFonts w:ascii="Times New Roman" w:hAnsi="Times New Roman" w:cs="Times New Roman"/>
+          <w:sz w:val="24"/>
+          <w:szCs w:val="24"/>
+          <w:lang w:val="en-IE"/>
+        </w:rPr>
+        <w:t xml:space="preserve"> Free Gluten Free Mushroom &amp; Roasted Garl...</w:t>
+      </w:r>
+    </w:p>
+    <w:p>
+      <w:pPr>
+        <w:pStyle w:val="ListParagraph"/>
+        <w:numPr>
+          <w:ilvl w:val="0"/>
+          <w:numId w:val="14"/>
+        </w:numPr>
+        <w:spacing w:before="240"/>
+        <w:jc w:val="both"/>
+        <w:rPr>
+          <w:rFonts w:ascii="Times New Roman" w:hAnsi="Times New Roman" w:cs="Times New Roman"/>
+          <w:sz w:val="24"/>
+          <w:szCs w:val="24"/>
+          <w:lang w:val="en-IE"/>
+        </w:rPr>
+      </w:pPr>
+      <w:r>
+        <w:rPr>
+          <w:rFonts w:ascii="Times New Roman" w:hAnsi="Times New Roman" w:cs="Times New Roman"/>
+          <w:sz w:val="24"/>
+          <w:szCs w:val="24"/>
+          <w:lang w:val="en-IE"/>
+        </w:rPr>
+        <w:t>Total rows: 2,426,378</w:t>
+      </w:r>
+    </w:p>
+    <w:p>
+      <w:pPr>
+        <w:pStyle w:val="ListParagraph"/>
+        <w:spacing w:before="240"/>
+        <w:jc w:val="both"/>
+        <w:rPr>
+          <w:rFonts w:ascii="Times New Roman" w:hAnsi="Times New Roman" w:cs="Times New Roman"/>
+          <w:sz w:val="24"/>
+          <w:szCs w:val="24"/>
+          <w:lang w:val="en-IE"/>
+        </w:rPr>
+      </w:pPr>
+    </w:p>
+    <w:p>
+      <w:pPr>
+        <w:pStyle w:val="ListParagraph"/>
+        <w:spacing w:before="240" w:after="0"/>
+        <w:ind w:left="0"/>
+        <w:jc w:val="both"/>
+        <w:rPr>
+          <w:rFonts w:ascii="Times New Roman" w:hAnsi="Times New Roman" w:cs="Times New Roman"/>
+          <w:sz w:val="24"/>
+          <w:szCs w:val="24"/>
+        </w:rPr>
+      </w:pPr>
+      <w:r>
+        <w:rPr>
+          <w:rFonts w:ascii="Times New Roman" w:hAnsi="Times New Roman" w:cs="Times New Roman"/>
+          <w:sz w:val="24"/>
+          <w:szCs w:val="24"/>
+        </w:rPr>
+        <w:t>Libraries and packages used in this project:</w:t>
+      </w:r>
+    </w:p>
+    <w:p>
+      <w:pPr>
+        <w:pStyle w:val="ListParagraph"/>
+        <w:numPr>
+          <w:ilvl w:val="1"/>
+          <w:numId w:val="15"/>
+        </w:numPr>
+        <w:spacing w:before="240" w:after="0"/>
+        <w:jc w:val="both"/>
+        <w:rPr>
+          <w:rFonts w:ascii="Times New Roman" w:hAnsi="Times New Roman" w:cs="Times New Roman"/>
+          <w:sz w:val="24"/>
+          <w:szCs w:val="24"/>
+        </w:rPr>
+      </w:pPr>
+      <w:r>
+        <w:rPr>
+          <w:rFonts w:ascii="Times New Roman" w:hAnsi="Times New Roman" w:cs="Times New Roman"/>
+          <w:sz w:val="24"/>
+          <w:szCs w:val="24"/>
+        </w:rPr>
+        <w:t>import pandas as pd</w:t>
+      </w:r>
+    </w:p>
+    <w:p>
+      <w:pPr>
+        <w:pStyle w:val="ListParagraph"/>
+        <w:numPr>
+          <w:ilvl w:val="1"/>
+          <w:numId w:val="15"/>
+        </w:numPr>
+        <w:spacing w:before="240" w:after="0"/>
+        <w:jc w:val="both"/>
+        <w:rPr>
+          <w:rFonts w:ascii="Times New Roman" w:hAnsi="Times New Roman" w:cs="Times New Roman"/>
+          <w:sz w:val="24"/>
+          <w:szCs w:val="24"/>
+        </w:rPr>
+      </w:pPr>
+      <w:r>
+        <w:rPr>
+          <w:rFonts w:ascii="Times New Roman" w:hAnsi="Times New Roman" w:cs="Times New Roman"/>
+          <w:sz w:val="24"/>
+          <w:szCs w:val="24"/>
+        </w:rPr>
+        <w:t xml:space="preserve">import </w:t>
+      </w:r>
+      <w:proofErr w:type="spellStart"/>
+      <w:r>
+        <w:rPr>
+          <w:rFonts w:ascii="Times New Roman" w:hAnsi="Times New Roman" w:cs="Times New Roman"/>
+          <w:sz w:val="24"/>
+          <w:szCs w:val="24"/>
+        </w:rPr>
+        <w:t>numpy</w:t>
+      </w:r>
+      <w:proofErr w:type="spellEnd"/>
+      <w:r>
+        <w:rPr>
+          <w:rFonts w:ascii="Times New Roman" w:hAnsi="Times New Roman" w:cs="Times New Roman"/>
+          <w:sz w:val="24"/>
+          <w:szCs w:val="24"/>
+        </w:rPr>
+        <w:t xml:space="preserve"> as np</w:t>
+      </w:r>
+    </w:p>
+    <w:p>
+      <w:pPr>
+        <w:pStyle w:val="ListParagraph"/>
+        <w:numPr>
+          <w:ilvl w:val="1"/>
+          <w:numId w:val="15"/>
+        </w:numPr>
+        <w:spacing w:before="240" w:after="0"/>
+        <w:jc w:val="both"/>
+        <w:rPr>
+          <w:rFonts w:ascii="Times New Roman" w:hAnsi="Times New Roman" w:cs="Times New Roman"/>
+          <w:sz w:val="24"/>
+          <w:szCs w:val="24"/>
+        </w:rPr>
+      </w:pPr>
+      <w:r>
+        <w:rPr>
+          <w:rFonts w:ascii="Times New Roman" w:hAnsi="Times New Roman" w:cs="Times New Roman"/>
+          <w:sz w:val="24"/>
+          <w:szCs w:val="24"/>
+        </w:rPr>
+        <w:t xml:space="preserve">import </w:t>
+      </w:r>
+      <w:proofErr w:type="spellStart"/>
+      <w:proofErr w:type="gramStart"/>
+      <w:r>
+        <w:rPr>
+          <w:rFonts w:ascii="Times New Roman" w:hAnsi="Times New Roman" w:cs="Times New Roman"/>
+          <w:sz w:val="24"/>
+          <w:szCs w:val="24"/>
+        </w:rPr>
+        <w:t>matplotlib.pyplot</w:t>
+      </w:r>
+      <w:proofErr w:type="spellEnd"/>
+      <w:proofErr w:type="gramEnd"/>
+      <w:r>
+        <w:rPr>
+          <w:rFonts w:ascii="Times New Roman" w:hAnsi="Times New Roman" w:cs="Times New Roman"/>
+          <w:sz w:val="24"/>
+          <w:szCs w:val="24"/>
+        </w:rPr>
+        <w:t xml:space="preserve"> as </w:t>
+      </w:r>
+      <w:proofErr w:type="spellStart"/>
+      <w:r>
+        <w:rPr>
+          <w:rFonts w:ascii="Times New Roman" w:hAnsi="Times New Roman" w:cs="Times New Roman"/>
+          <w:sz w:val="24"/>
+          <w:szCs w:val="24"/>
+        </w:rPr>
+        <w:t>plt</w:t>
+      </w:r>
+      <w:proofErr w:type="spellEnd"/>
+    </w:p>
+    <w:p>
+      <w:pPr>
+        <w:pStyle w:val="ListParagraph"/>
+        <w:numPr>
+          <w:ilvl w:val="1"/>
+          <w:numId w:val="15"/>
+        </w:numPr>
+        <w:spacing w:before="240" w:after="0"/>
+        <w:jc w:val="both"/>
+        <w:rPr>
+          <w:rFonts w:ascii="Times New Roman" w:hAnsi="Times New Roman" w:cs="Times New Roman"/>
+          <w:sz w:val="24"/>
+          <w:szCs w:val="24"/>
+        </w:rPr>
+      </w:pPr>
+      <w:r>
+        <w:rPr>
+          <w:rFonts w:ascii="Times New Roman" w:hAnsi="Times New Roman" w:cs="Times New Roman"/>
+          <w:sz w:val="24"/>
+          <w:szCs w:val="24"/>
+        </w:rPr>
+        <w:t>import re</w:t>
+      </w:r>
+    </w:p>
+    <w:p>
+      <w:pPr>
+        <w:pStyle w:val="ListParagraph"/>
+        <w:numPr>
+          <w:ilvl w:val="1"/>
+          <w:numId w:val="15"/>
+        </w:numPr>
+        <w:spacing w:before="240" w:after="0"/>
+        <w:jc w:val="both"/>
+        <w:rPr>
+          <w:rFonts w:ascii="Times New Roman" w:hAnsi="Times New Roman" w:cs="Times New Roman"/>
+          <w:sz w:val="24"/>
+          <w:szCs w:val="24"/>
+        </w:rPr>
+      </w:pPr>
+      <w:r>
+        <w:rPr>
+          <w:rFonts w:ascii="Times New Roman" w:hAnsi="Times New Roman" w:cs="Times New Roman"/>
+          <w:sz w:val="24"/>
+          <w:szCs w:val="24"/>
+        </w:rPr>
+        <w:t xml:space="preserve">import </w:t>
+      </w:r>
+      <w:proofErr w:type="spellStart"/>
+      <w:r>
+        <w:rPr>
+          <w:rFonts w:ascii="Times New Roman" w:hAnsi="Times New Roman" w:cs="Times New Roman"/>
+          <w:sz w:val="24"/>
+          <w:szCs w:val="24"/>
+        </w:rPr>
+        <w:t>tqdm</w:t>
+      </w:r>
+      <w:proofErr w:type="spellEnd"/>
+      <w:r>
+        <w:rPr>
+          <w:rFonts w:ascii="Times New Roman" w:hAnsi="Times New Roman" w:cs="Times New Roman"/>
+          <w:sz w:val="24"/>
+          <w:szCs w:val="24"/>
+        </w:rPr>
+        <w:t xml:space="preserve"> </w:t>
+      </w:r>
+    </w:p>
+    <w:p>
+      <w:pPr>
+        <w:pStyle w:val="ListParagraph"/>
+        <w:numPr>
+          <w:ilvl w:val="1"/>
+          <w:numId w:val="15"/>
+        </w:numPr>
+        <w:spacing w:before="240" w:after="0"/>
+        <w:jc w:val="both"/>
+        <w:rPr>
+          <w:rFonts w:ascii="Times New Roman" w:hAnsi="Times New Roman" w:cs="Times New Roman"/>
+          <w:sz w:val="24"/>
+          <w:szCs w:val="24"/>
+        </w:rPr>
+      </w:pPr>
+      <w:r>
+        <w:rPr>
+          <w:rFonts w:ascii="Times New Roman" w:hAnsi="Times New Roman" w:cs="Times New Roman"/>
+          <w:sz w:val="24"/>
+          <w:szCs w:val="24"/>
+        </w:rPr>
+        <w:t xml:space="preserve">from </w:t>
+      </w:r>
+      <w:proofErr w:type="spellStart"/>
+      <w:proofErr w:type="gramStart"/>
+      <w:r>
+        <w:rPr>
+          <w:rFonts w:ascii="Times New Roman" w:hAnsi="Times New Roman" w:cs="Times New Roman"/>
+          <w:sz w:val="24"/>
+          <w:szCs w:val="24"/>
+        </w:rPr>
+        <w:t>sklearn.metrics</w:t>
+      </w:r>
+      <w:proofErr w:type="gramEnd"/>
+      <w:r>
+        <w:rPr>
+          <w:rFonts w:ascii="Times New Roman" w:hAnsi="Times New Roman" w:cs="Times New Roman"/>
+          <w:sz w:val="24"/>
+          <w:szCs w:val="24"/>
+        </w:rPr>
+        <w:t>.pairwise</w:t>
+      </w:r>
+      <w:proofErr w:type="spellEnd"/>
+      <w:r>
+        <w:rPr>
+          <w:rFonts w:ascii="Times New Roman" w:hAnsi="Times New Roman" w:cs="Times New Roman"/>
+          <w:sz w:val="24"/>
+          <w:szCs w:val="24"/>
+        </w:rPr>
+        <w:t xml:space="preserve"> import </w:t>
+      </w:r>
+      <w:proofErr w:type="spellStart"/>
+      <w:r>
+        <w:rPr>
+          <w:rFonts w:ascii="Times New Roman" w:hAnsi="Times New Roman" w:cs="Times New Roman"/>
+          <w:sz w:val="24"/>
+          <w:szCs w:val="24"/>
+        </w:rPr>
+        <w:t>cosine_similarity</w:t>
+      </w:r>
+      <w:proofErr w:type="spellEnd"/>
+    </w:p>
+    <w:p>
+      <w:pPr>
+        <w:pStyle w:val="ListParagraph"/>
+        <w:numPr>
+          <w:ilvl w:val="1"/>
+          <w:numId w:val="15"/>
+        </w:numPr>
+        <w:spacing w:before="240" w:after="0"/>
+        <w:jc w:val="both"/>
+        <w:rPr>
+          <w:rFonts w:ascii="Times New Roman" w:hAnsi="Times New Roman" w:cs="Times New Roman"/>
+          <w:sz w:val="24"/>
+          <w:szCs w:val="24"/>
+        </w:rPr>
+      </w:pPr>
+      <w:r>
+        <w:rPr>
+          <w:rFonts w:ascii="Times New Roman" w:hAnsi="Times New Roman" w:cs="Times New Roman"/>
+          <w:sz w:val="24"/>
+          <w:szCs w:val="24"/>
+        </w:rPr>
+        <w:t xml:space="preserve">from </w:t>
+      </w:r>
+      <w:proofErr w:type="spellStart"/>
+      <w:proofErr w:type="gramStart"/>
+      <w:r>
+        <w:rPr>
+          <w:rFonts w:ascii="Times New Roman" w:hAnsi="Times New Roman" w:cs="Times New Roman"/>
+          <w:sz w:val="24"/>
+          <w:szCs w:val="24"/>
+        </w:rPr>
+        <w:t>mlxtend.preprocessing</w:t>
+      </w:r>
+      <w:proofErr w:type="spellEnd"/>
+      <w:proofErr w:type="gramEnd"/>
+      <w:r>
+        <w:rPr>
+          <w:rFonts w:ascii="Times New Roman" w:hAnsi="Times New Roman" w:cs="Times New Roman"/>
+          <w:sz w:val="24"/>
+          <w:szCs w:val="24"/>
+        </w:rPr>
+        <w:t xml:space="preserve"> import </w:t>
+      </w:r>
+      <w:proofErr w:type="spellStart"/>
+      <w:r>
+        <w:rPr>
+          <w:rFonts w:ascii="Times New Roman" w:hAnsi="Times New Roman" w:cs="Times New Roman"/>
+          <w:sz w:val="24"/>
+          <w:szCs w:val="24"/>
+        </w:rPr>
+        <w:t>TransactionEncoder</w:t>
+      </w:r>
+      <w:proofErr w:type="spellEnd"/>
+    </w:p>
+    <w:p>
+      <w:pPr>
+        <w:pStyle w:val="ListParagraph"/>
+        <w:numPr>
+          <w:ilvl w:val="1"/>
+          <w:numId w:val="15"/>
+        </w:numPr>
+        <w:spacing w:before="240" w:after="0"/>
+        <w:jc w:val="both"/>
+        <w:rPr>
+          <w:rFonts w:ascii="Times New Roman" w:hAnsi="Times New Roman" w:cs="Times New Roman"/>
+          <w:sz w:val="24"/>
+          <w:szCs w:val="24"/>
+        </w:rPr>
+      </w:pPr>
+      <w:r>
+        <w:rPr>
+          <w:rFonts w:ascii="Times New Roman" w:hAnsi="Times New Roman" w:cs="Times New Roman"/>
+          <w:sz w:val="24"/>
+          <w:szCs w:val="24"/>
+        </w:rPr>
+        <w:t xml:space="preserve">from </w:t>
+      </w:r>
+      <w:proofErr w:type="spellStart"/>
+      <w:proofErr w:type="gramStart"/>
+      <w:r>
+        <w:rPr>
+          <w:rFonts w:ascii="Times New Roman" w:hAnsi="Times New Roman" w:cs="Times New Roman"/>
+          <w:sz w:val="24"/>
+          <w:szCs w:val="24"/>
+        </w:rPr>
+        <w:t>mlxtend.frequent</w:t>
+      </w:r>
+      <w:proofErr w:type="gramEnd"/>
+      <w:r>
+        <w:rPr>
+          <w:rFonts w:ascii="Times New Roman" w:hAnsi="Times New Roman" w:cs="Times New Roman"/>
+          <w:sz w:val="24"/>
+          <w:szCs w:val="24"/>
+        </w:rPr>
+        <w:t>_patterns</w:t>
+      </w:r>
+      <w:proofErr w:type="spellEnd"/>
+      <w:r>
+        <w:rPr>
+          <w:rFonts w:ascii="Times New Roman" w:hAnsi="Times New Roman" w:cs="Times New Roman"/>
+          <w:sz w:val="24"/>
+          <w:szCs w:val="24"/>
+        </w:rPr>
+        <w:t xml:space="preserve"> </w:t>
+      </w:r>
+    </w:p>
+    <w:p>
+      <w:pPr>
+        <w:pStyle w:val="ListParagraph"/>
+        <w:numPr>
+          <w:ilvl w:val="1"/>
+          <w:numId w:val="15"/>
+        </w:numPr>
+        <w:spacing w:before="240" w:after="0"/>
+        <w:jc w:val="both"/>
+        <w:rPr>
+          <w:rFonts w:ascii="Times New Roman" w:hAnsi="Times New Roman" w:cs="Times New Roman"/>
+          <w:sz w:val="24"/>
+          <w:szCs w:val="24"/>
+        </w:rPr>
+      </w:pPr>
+      <w:r>
+        <w:rPr>
+          <w:rFonts w:ascii="Times New Roman" w:hAnsi="Times New Roman" w:cs="Times New Roman"/>
+          <w:sz w:val="24"/>
+          <w:szCs w:val="24"/>
+        </w:rPr>
+        <w:t xml:space="preserve">import </w:t>
+      </w:r>
+      <w:proofErr w:type="spellStart"/>
+      <w:r>
+        <w:rPr>
+          <w:rFonts w:ascii="Times New Roman" w:hAnsi="Times New Roman" w:cs="Times New Roman"/>
+          <w:sz w:val="24"/>
+          <w:szCs w:val="24"/>
+        </w:rPr>
+        <w:t>apriori</w:t>
+      </w:r>
+      <w:proofErr w:type="spellEnd"/>
+      <w:r>
+        <w:rPr>
+          <w:rFonts w:ascii="Times New Roman" w:hAnsi="Times New Roman" w:cs="Times New Roman"/>
+          <w:sz w:val="24"/>
+          <w:szCs w:val="24"/>
+        </w:rPr>
+        <w:t xml:space="preserve">, </w:t>
+      </w:r>
+      <w:proofErr w:type="spellStart"/>
+      <w:r>
+        <w:rPr>
+          <w:rFonts w:ascii="Times New Roman" w:hAnsi="Times New Roman" w:cs="Times New Roman"/>
+          <w:sz w:val="24"/>
+          <w:szCs w:val="24"/>
+        </w:rPr>
+        <w:t>fpgrowth</w:t>
+      </w:r>
+      <w:proofErr w:type="spellEnd"/>
+      <w:r>
+        <w:rPr>
+          <w:rFonts w:ascii="Times New Roman" w:hAnsi="Times New Roman" w:cs="Times New Roman"/>
+          <w:sz w:val="24"/>
+          <w:szCs w:val="24"/>
+        </w:rPr>
+        <w:t xml:space="preserve">, </w:t>
+      </w:r>
+      <w:proofErr w:type="spellStart"/>
+      <w:r>
+        <w:rPr>
+          <w:rFonts w:ascii="Times New Roman" w:hAnsi="Times New Roman" w:cs="Times New Roman"/>
+          <w:sz w:val="24"/>
+          <w:szCs w:val="24"/>
+        </w:rPr>
+        <w:t>association_rules</w:t>
+      </w:r>
+      <w:proofErr w:type="spellEnd"/>
+    </w:p>
+    <w:p>
+      <w:pPr>
+        <w:pStyle w:val="ListParagraph"/>
+        <w:numPr>
+          <w:ilvl w:val="1"/>
+          <w:numId w:val="15"/>
+        </w:numPr>
+        <w:spacing w:before="240" w:after="0"/>
+        <w:jc w:val="both"/>
+        <w:rPr>
+          <w:rFonts w:ascii="Times New Roman" w:hAnsi="Times New Roman" w:cs="Times New Roman"/>
+          <w:sz w:val="24"/>
+          <w:szCs w:val="24"/>
+        </w:rPr>
+      </w:pPr>
+      <w:r>
+        <w:rPr>
+          <w:rFonts w:ascii="Times New Roman" w:hAnsi="Times New Roman" w:cs="Times New Roman"/>
+          <w:sz w:val="24"/>
+          <w:szCs w:val="24"/>
+        </w:rPr>
+        <w:t xml:space="preserve">from </w:t>
+      </w:r>
+      <w:proofErr w:type="spellStart"/>
+      <w:proofErr w:type="gramStart"/>
+      <w:r>
+        <w:rPr>
+          <w:rFonts w:ascii="Times New Roman" w:hAnsi="Times New Roman" w:cs="Times New Roman"/>
+          <w:sz w:val="24"/>
+          <w:szCs w:val="24"/>
+        </w:rPr>
+        <w:t>scipy.sparse</w:t>
+      </w:r>
+      <w:proofErr w:type="spellEnd"/>
+      <w:proofErr w:type="gramEnd"/>
+      <w:r>
+        <w:rPr>
+          <w:rFonts w:ascii="Times New Roman" w:hAnsi="Times New Roman" w:cs="Times New Roman"/>
+          <w:sz w:val="24"/>
+          <w:szCs w:val="24"/>
+        </w:rPr>
+        <w:t xml:space="preserve"> import </w:t>
+      </w:r>
+      <w:proofErr w:type="spellStart"/>
+      <w:r>
+        <w:rPr>
+          <w:rFonts w:ascii="Times New Roman" w:hAnsi="Times New Roman" w:cs="Times New Roman"/>
+          <w:sz w:val="24"/>
+          <w:szCs w:val="24"/>
+        </w:rPr>
+        <w:t>csr_matrix</w:t>
+      </w:r>
+      <w:proofErr w:type="spellEnd"/>
+    </w:p>
+    <w:p>
+      <w:pPr>
+        <w:pStyle w:val="ListParagraph"/>
+        <w:numPr>
+          <w:ilvl w:val="1"/>
+          <w:numId w:val="15"/>
+        </w:numPr>
+        <w:spacing w:before="240" w:after="0"/>
+        <w:jc w:val="both"/>
+        <w:rPr>
+          <w:rFonts w:ascii="Times New Roman" w:hAnsi="Times New Roman" w:cs="Times New Roman"/>
+          <w:sz w:val="24"/>
+          <w:szCs w:val="24"/>
+        </w:rPr>
+      </w:pPr>
+      <w:r>
+        <w:rPr>
+          <w:rFonts w:ascii="Times New Roman" w:hAnsi="Times New Roman" w:cs="Times New Roman"/>
+          <w:sz w:val="24"/>
+          <w:szCs w:val="24"/>
+        </w:rPr>
+        <w:t xml:space="preserve">from </w:t>
+      </w:r>
+      <w:proofErr w:type="spellStart"/>
+      <w:proofErr w:type="gramStart"/>
+      <w:r>
+        <w:rPr>
+          <w:rFonts w:ascii="Times New Roman" w:hAnsi="Times New Roman" w:cs="Times New Roman"/>
+          <w:sz w:val="24"/>
+          <w:szCs w:val="24"/>
+        </w:rPr>
+        <w:t>sklearn.metrics</w:t>
+      </w:r>
+      <w:proofErr w:type="gramEnd"/>
+      <w:r>
+        <w:rPr>
+          <w:rFonts w:ascii="Times New Roman" w:hAnsi="Times New Roman" w:cs="Times New Roman"/>
+          <w:sz w:val="24"/>
+          <w:szCs w:val="24"/>
+        </w:rPr>
+        <w:t>.pairwise</w:t>
+      </w:r>
+      <w:proofErr w:type="spellEnd"/>
+      <w:r>
+        <w:rPr>
+          <w:rFonts w:ascii="Times New Roman" w:hAnsi="Times New Roman" w:cs="Times New Roman"/>
+          <w:sz w:val="24"/>
+          <w:szCs w:val="24"/>
+        </w:rPr>
+        <w:t xml:space="preserve"> import </w:t>
+      </w:r>
+      <w:proofErr w:type="spellStart"/>
+      <w:r>
+        <w:rPr>
+          <w:rFonts w:ascii="Times New Roman" w:hAnsi="Times New Roman" w:cs="Times New Roman"/>
+          <w:sz w:val="24"/>
+          <w:szCs w:val="24"/>
+        </w:rPr>
+        <w:t>cosine_similarity</w:t>
+      </w:r>
+      <w:proofErr w:type="spellEnd"/>
+    </w:p>
+    <w:p>
+      <w:pPr>
+        <w:pStyle w:val="ListParagraph"/>
+        <w:numPr>
+          <w:ilvl w:val="1"/>
+          <w:numId w:val="15"/>
+        </w:numPr>
+        <w:spacing w:before="240" w:after="0"/>
+        <w:jc w:val="both"/>
+        <w:rPr>
+          <w:rFonts w:ascii="Times New Roman" w:hAnsi="Times New Roman" w:cs="Times New Roman"/>
+          <w:sz w:val="24"/>
+          <w:szCs w:val="24"/>
+        </w:rPr>
+      </w:pPr>
+      <w:r>
+        <w:rPr>
+          <w:rFonts w:ascii="Times New Roman" w:hAnsi="Times New Roman" w:cs="Times New Roman"/>
+          <w:sz w:val="24"/>
+          <w:szCs w:val="24"/>
+        </w:rPr>
+        <w:t xml:space="preserve">import </w:t>
+      </w:r>
+      <w:proofErr w:type="spellStart"/>
+      <w:r>
+        <w:rPr>
+          <w:rFonts w:ascii="Times New Roman" w:hAnsi="Times New Roman" w:cs="Times New Roman"/>
+          <w:sz w:val="24"/>
+          <w:szCs w:val="24"/>
+        </w:rPr>
+        <w:t>tkinter</w:t>
+      </w:r>
+      <w:proofErr w:type="spellEnd"/>
+      <w:r>
+        <w:rPr>
+          <w:rFonts w:ascii="Times New Roman" w:hAnsi="Times New Roman" w:cs="Times New Roman"/>
+          <w:sz w:val="24"/>
+          <w:szCs w:val="24"/>
+        </w:rPr>
+        <w:t xml:space="preserve"> as </w:t>
+      </w:r>
+      <w:proofErr w:type="spellStart"/>
+      <w:r>
+        <w:rPr>
+          <w:rFonts w:ascii="Times New Roman" w:hAnsi="Times New Roman" w:cs="Times New Roman"/>
+          <w:sz w:val="24"/>
+          <w:szCs w:val="24"/>
+        </w:rPr>
+        <w:t>tk</w:t>
+      </w:r>
+      <w:proofErr w:type="spellEnd"/>
+    </w:p>
+    <w:p>
+      <w:pPr>
+        <w:pStyle w:val="ListParagraph"/>
+        <w:numPr>
+          <w:ilvl w:val="1"/>
+          <w:numId w:val="15"/>
+        </w:numPr>
+        <w:spacing w:before="240" w:after="0"/>
+        <w:jc w:val="both"/>
+        <w:rPr>
+          <w:rFonts w:ascii="Times New Roman" w:hAnsi="Times New Roman" w:cs="Times New Roman"/>
+          <w:sz w:val="24"/>
+          <w:szCs w:val="24"/>
+        </w:rPr>
+      </w:pPr>
+      <w:r>
+        <w:rPr>
+          <w:rFonts w:ascii="Times New Roman" w:hAnsi="Times New Roman" w:cs="Times New Roman"/>
+          <w:sz w:val="24"/>
+          <w:szCs w:val="24"/>
+        </w:rPr>
+        <w:t xml:space="preserve">from </w:t>
+      </w:r>
+      <w:proofErr w:type="spellStart"/>
+      <w:r>
+        <w:rPr>
+          <w:rFonts w:ascii="Times New Roman" w:hAnsi="Times New Roman" w:cs="Times New Roman"/>
+          <w:sz w:val="24"/>
+          <w:szCs w:val="24"/>
+        </w:rPr>
+        <w:t>tkinter</w:t>
+      </w:r>
+      <w:proofErr w:type="spellEnd"/>
+      <w:r>
+        <w:rPr>
+          <w:rFonts w:ascii="Times New Roman" w:hAnsi="Times New Roman" w:cs="Times New Roman"/>
+          <w:sz w:val="24"/>
+          <w:szCs w:val="24"/>
+        </w:rPr>
+        <w:t xml:space="preserve"> import </w:t>
+      </w:r>
+      <w:proofErr w:type="spellStart"/>
+      <w:r>
+        <w:rPr>
+          <w:rFonts w:ascii="Times New Roman" w:hAnsi="Times New Roman" w:cs="Times New Roman"/>
+          <w:sz w:val="24"/>
+          <w:szCs w:val="24"/>
+        </w:rPr>
+        <w:t>ttk</w:t>
+      </w:r>
+      <w:proofErr w:type="spellEnd"/>
+    </w:p>
+    <w:p>
+      <w:pPr>
+        <w:pStyle w:val="ListParagraph"/>
+        <w:numPr>
+          <w:ilvl w:val="1"/>
+          <w:numId w:val="15"/>
+        </w:numPr>
+        <w:spacing w:before="240" w:after="0"/>
+        <w:jc w:val="both"/>
+        <w:rPr>
+          <w:rFonts w:ascii="Times New Roman" w:hAnsi="Times New Roman" w:cs="Times New Roman"/>
+          <w:sz w:val="24"/>
+          <w:szCs w:val="24"/>
+        </w:rPr>
+      </w:pPr>
+      <w:r>
+        <w:rPr>
+          <w:rFonts w:ascii="Times New Roman" w:hAnsi="Times New Roman" w:cs="Times New Roman"/>
+          <w:sz w:val="24"/>
+          <w:szCs w:val="24"/>
+        </w:rPr>
+        <w:t xml:space="preserve">from </w:t>
+      </w:r>
+      <w:proofErr w:type="spellStart"/>
+      <w:r>
+        <w:rPr>
+          <w:rFonts w:ascii="Times New Roman" w:hAnsi="Times New Roman" w:cs="Times New Roman"/>
+          <w:sz w:val="24"/>
+          <w:szCs w:val="24"/>
+        </w:rPr>
+        <w:t>ChartForgeTK</w:t>
+      </w:r>
+      <w:proofErr w:type="spellEnd"/>
+      <w:r>
+        <w:rPr>
+          <w:rFonts w:ascii="Times New Roman" w:hAnsi="Times New Roman" w:cs="Times New Roman"/>
+          <w:sz w:val="24"/>
+          <w:szCs w:val="24"/>
+        </w:rPr>
+        <w:t xml:space="preserve"> import </w:t>
+      </w:r>
+      <w:proofErr w:type="spellStart"/>
+      <w:r>
+        <w:rPr>
+          <w:rFonts w:ascii="Times New Roman" w:hAnsi="Times New Roman" w:cs="Times New Roman"/>
+          <w:sz w:val="24"/>
+          <w:szCs w:val="24"/>
+        </w:rPr>
+        <w:t>BarChart</w:t>
+      </w:r>
+      <w:proofErr w:type="spellEnd"/>
+      <w:r>
+        <w:rPr>
+          <w:rFonts w:ascii="Times New Roman" w:hAnsi="Times New Roman" w:cs="Times New Roman"/>
+          <w:sz w:val="24"/>
+          <w:szCs w:val="24"/>
+        </w:rPr>
+        <w:t xml:space="preserve">, </w:t>
+      </w:r>
+      <w:proofErr w:type="spellStart"/>
+      <w:r>
+        <w:rPr>
+          <w:rFonts w:ascii="Times New Roman" w:hAnsi="Times New Roman" w:cs="Times New Roman"/>
+          <w:sz w:val="24"/>
+          <w:szCs w:val="24"/>
+        </w:rPr>
+        <w:t>PieChart</w:t>
+      </w:r>
+      <w:proofErr w:type="spellEnd"/>
+    </w:p>
+    <w:p>
+      <w:pPr>
+        <w:pStyle w:val="ListParagraph"/>
+        <w:numPr>
+          <w:ilvl w:val="1"/>
+          <w:numId w:val="15"/>
+        </w:numPr>
+        <w:spacing w:before="240" w:after="0"/>
+        <w:jc w:val="both"/>
+        <w:rPr>
+          <w:rFonts w:ascii="Times New Roman" w:hAnsi="Times New Roman" w:cs="Times New Roman"/>
+          <w:sz w:val="24"/>
+          <w:szCs w:val="24"/>
+        </w:rPr>
+      </w:pPr>
+      <w:r>
+        <w:rPr>
+          <w:rFonts w:ascii="Times New Roman" w:hAnsi="Times New Roman" w:cs="Times New Roman"/>
+          <w:sz w:val="24"/>
+          <w:szCs w:val="24"/>
+        </w:rPr>
+        <w:t>import random</w:t>
+      </w:r>
+      <w:r>
+        <w:rPr>
+          <w:rFonts w:ascii="Times New Roman" w:hAnsi="Times New Roman" w:cs="Times New Roman"/>
+          <w:sz w:val="24"/>
+          <w:szCs w:val="24"/>
+        </w:rPr>
+        <w:t xml:space="preserve"> </w:t>
+      </w:r>
+    </w:p>
+    <w:p>
+      <w:pPr>
+        <w:pStyle w:val="ListParagraph"/>
+        <w:numPr>
+          <w:ilvl w:val="1"/>
+          <w:numId w:val="15"/>
+        </w:numPr>
+        <w:spacing w:before="240" w:after="0"/>
+        <w:jc w:val="both"/>
+        <w:rPr>
+          <w:rFonts w:ascii="Times New Roman" w:hAnsi="Times New Roman" w:cs="Times New Roman"/>
+          <w:sz w:val="24"/>
+          <w:szCs w:val="24"/>
+        </w:rPr>
+      </w:pPr>
+      <w:r>
+        <w:rPr>
+          <w:rFonts w:ascii="Times New Roman" w:hAnsi="Times New Roman" w:cs="Times New Roman"/>
+          <w:sz w:val="24"/>
+          <w:szCs w:val="24"/>
+        </w:rPr>
+        <w:t>import warnings</w:t>
+      </w:r>
+    </w:p>
+    <w:p>
+      <w:pPr>
+        <w:pStyle w:val="ListParagraph"/>
+        <w:spacing w:before="240" w:after="0"/>
+        <w:ind w:left="0"/>
+        <w:jc w:val="both"/>
+        <w:rPr>
+          <w:rFonts w:ascii="Times New Roman" w:hAnsi="Times New Roman" w:cs="Times New Roman"/>
+          <w:sz w:val="24"/>
+          <w:szCs w:val="24"/>
+        </w:rPr>
+      </w:pPr>
+    </w:p>
+    <w:p>
+      <w:pPr>
+        <w:pStyle w:val="ListParagraph"/>
         <w:spacing w:before="240" w:after="0"/>
         <w:ind w:left="0"/>
         <w:jc w:val="both"/>
@@ -1663,6 +3098,7 @@
           <w:sz w:val="24"/>
           <w:szCs w:val="24"/>
         </w:rPr>
+        <w:lastRenderedPageBreak/>
         <w:t>Organic Whole Strawberry (0.0569)</w:t>
       </w:r>
     </w:p>
@@ -2255,7 +3691,6 @@
           <w:sz w:val="24"/>
           <w:szCs w:val="24"/>
         </w:rPr>
-        <w:lastRenderedPageBreak/>
         <w:t xml:space="preserve">(Organic Bakery Hamburger Buns Wheat – 8 CT) </w:t>
       </w:r>
       <w:proofErr w:type="gramStart"/>
@@ -2401,6 +3836,7 @@
           <w:sz w:val="24"/>
           <w:szCs w:val="24"/>
         </w:rPr>
+        <w:lastRenderedPageBreak/>
         <w:t>The Lift Metric: Advantages, Disadvantages and Justification</w:t>
       </w:r>
     </w:p>
@@ -2860,17 +4296,14 @@
           <w:szCs w:val="24"/>
         </w:rPr>
       </w:pPr>
-    </w:p>
-    <w:p>
-      <w:pPr>
-        <w:spacing w:before="240" w:after="0"/>
-        <w:jc w:val="both"/>
-        <w:rPr>
-          <w:rFonts w:ascii="Times New Roman" w:hAnsi="Times New Roman" w:cs="Times New Roman"/>
-          <w:sz w:val="24"/>
-          <w:szCs w:val="24"/>
-        </w:rPr>
-      </w:pPr>
+      <w:r>
+        <w:rPr>
+          <w:rFonts w:ascii="Times New Roman" w:hAnsi="Times New Roman" w:cs="Times New Roman"/>
+          <w:sz w:val="24"/>
+          <w:szCs w:val="24"/>
+        </w:rPr>
+        <w:t>The discovered rules enable powerful applications such as dynamic product bundling, intelligent recommendation placement, and target promotions in online grocery platforms.</w:t>
+      </w:r>
     </w:p>
     <w:p>
       <w:pPr>
@@ -2912,6 +4345,478 @@
         <w:jc w:val="both"/>
         <w:rPr>
           <w:rFonts w:ascii="Times New Roman" w:hAnsi="Times New Roman" w:cs="Times New Roman"/>
+          <w:b/>
+          <w:bCs/>
+          <w:sz w:val="24"/>
+          <w:szCs w:val="24"/>
+        </w:rPr>
+      </w:pPr>
+      <w:r>
+        <w:rPr>
+          <w:rFonts w:ascii="Times New Roman" w:hAnsi="Times New Roman" w:cs="Times New Roman"/>
+          <w:b/>
+          <w:bCs/>
+          <w:sz w:val="24"/>
+          <w:szCs w:val="24"/>
+        </w:rPr>
+        <w:t>Question 3: Interactive Dashboard for Adults (65+ years demographic)</w:t>
+      </w:r>
+    </w:p>
+    <w:p>
+      <w:pPr>
+        <w:spacing w:before="240" w:after="0"/>
+        <w:jc w:val="both"/>
+        <w:rPr>
+          <w:rFonts w:ascii="Times New Roman" w:hAnsi="Times New Roman" w:cs="Times New Roman"/>
+          <w:b/>
+          <w:bCs/>
+          <w:sz w:val="24"/>
+          <w:szCs w:val="24"/>
+        </w:rPr>
+      </w:pPr>
+      <w:r>
+        <w:rPr>
+          <w:rFonts w:ascii="Times New Roman" w:hAnsi="Times New Roman" w:cs="Times New Roman"/>
+          <w:b/>
+          <w:bCs/>
+          <w:sz w:val="24"/>
+          <w:szCs w:val="24"/>
+        </w:rPr>
+        <w:t>Dashboard Design Rationale</w:t>
+      </w:r>
+    </w:p>
+    <w:p>
+      <w:pPr>
+        <w:spacing w:before="240" w:after="0"/>
+        <w:jc w:val="both"/>
+        <w:rPr>
+          <w:rFonts w:ascii="Times New Roman" w:hAnsi="Times New Roman" w:cs="Times New Roman"/>
+          <w:sz w:val="24"/>
+          <w:szCs w:val="24"/>
+        </w:rPr>
+      </w:pPr>
+      <w:r>
+        <w:rPr>
+          <w:rFonts w:ascii="Times New Roman" w:hAnsi="Times New Roman" w:cs="Times New Roman"/>
+          <w:sz w:val="24"/>
+          <w:szCs w:val="24"/>
+        </w:rPr>
+        <w:t xml:space="preserve">The interactive dashboard </w:t>
+      </w:r>
+      <w:r>
+        <w:rPr>
+          <w:rFonts w:ascii="Times New Roman" w:hAnsi="Times New Roman" w:cs="Times New Roman"/>
+          <w:sz w:val="24"/>
+          <w:szCs w:val="24"/>
+        </w:rPr>
+        <w:t xml:space="preserve">was developed using </w:t>
+      </w:r>
+      <w:proofErr w:type="spellStart"/>
+      <w:r>
+        <w:rPr>
+          <w:rFonts w:ascii="Times New Roman" w:hAnsi="Times New Roman" w:cs="Times New Roman"/>
+          <w:sz w:val="24"/>
+          <w:szCs w:val="24"/>
+        </w:rPr>
+        <w:t>Streamlit</w:t>
+      </w:r>
+      <w:proofErr w:type="spellEnd"/>
+      <w:r>
+        <w:rPr>
+          <w:rFonts w:ascii="Times New Roman" w:hAnsi="Times New Roman" w:cs="Times New Roman"/>
+          <w:sz w:val="24"/>
+          <w:szCs w:val="24"/>
+        </w:rPr>
+        <w:t xml:space="preserve"> to present hey insights from the dataset in an accessible format for adults aged 65 and above. Design decisions were guided by accessibility </w:t>
+      </w:r>
+      <w:r>
+        <w:rPr>
+          <w:rFonts w:ascii="Times New Roman" w:hAnsi="Times New Roman" w:cs="Times New Roman"/>
+          <w:sz w:val="24"/>
+          <w:szCs w:val="24"/>
+        </w:rPr>
+        <w:lastRenderedPageBreak/>
+        <w:t>principle for older users, including larger fonts, high contrast colours (blue, green rules and supportive colours for colour-blind users), and a clean one-page layout.</w:t>
+      </w:r>
+    </w:p>
+    <w:p>
+      <w:pPr>
+        <w:spacing w:before="240" w:after="0"/>
+        <w:jc w:val="both"/>
+        <w:rPr>
+          <w:rFonts w:ascii="Times New Roman" w:hAnsi="Times New Roman" w:cs="Times New Roman"/>
+          <w:b/>
+          <w:bCs/>
+          <w:sz w:val="24"/>
+          <w:szCs w:val="24"/>
+        </w:rPr>
+      </w:pPr>
+      <w:r>
+        <w:rPr>
+          <w:rFonts w:ascii="Times New Roman" w:hAnsi="Times New Roman" w:cs="Times New Roman"/>
+          <w:b/>
+          <w:bCs/>
+          <w:sz w:val="24"/>
+          <w:szCs w:val="24"/>
+        </w:rPr>
+        <w:t>Key Features:</w:t>
+      </w:r>
+    </w:p>
+    <w:p>
+      <w:pPr>
+        <w:pStyle w:val="ListParagraph"/>
+        <w:numPr>
+          <w:ilvl w:val="0"/>
+          <w:numId w:val="8"/>
+        </w:numPr>
+        <w:spacing w:before="240" w:after="0"/>
+        <w:jc w:val="both"/>
+        <w:rPr>
+          <w:rFonts w:ascii="Times New Roman" w:hAnsi="Times New Roman" w:cs="Times New Roman"/>
+          <w:sz w:val="24"/>
+          <w:szCs w:val="24"/>
+        </w:rPr>
+      </w:pPr>
+      <w:r>
+        <w:rPr>
+          <w:rFonts w:ascii="Times New Roman" w:hAnsi="Times New Roman" w:cs="Times New Roman"/>
+          <w:b/>
+          <w:bCs/>
+          <w:sz w:val="24"/>
+          <w:szCs w:val="24"/>
+        </w:rPr>
+        <w:t>Top 15 Most Popular Items</w:t>
+      </w:r>
+      <w:r>
+        <w:rPr>
+          <w:rFonts w:ascii="Times New Roman" w:hAnsi="Times New Roman" w:cs="Times New Roman"/>
+          <w:sz w:val="24"/>
+          <w:szCs w:val="24"/>
+        </w:rPr>
+        <w:t xml:space="preserve"> – Bar chart showing frequently purchased grocery products.</w:t>
+      </w:r>
+    </w:p>
+    <w:p>
+      <w:pPr>
+        <w:pStyle w:val="ListParagraph"/>
+        <w:numPr>
+          <w:ilvl w:val="0"/>
+          <w:numId w:val="8"/>
+        </w:numPr>
+        <w:spacing w:before="240" w:after="0"/>
+        <w:jc w:val="both"/>
+        <w:rPr>
+          <w:rFonts w:ascii="Times New Roman" w:hAnsi="Times New Roman" w:cs="Times New Roman"/>
+          <w:sz w:val="24"/>
+          <w:szCs w:val="24"/>
+        </w:rPr>
+      </w:pPr>
+      <w:r>
+        <w:rPr>
+          <w:rFonts w:ascii="Times New Roman" w:hAnsi="Times New Roman" w:cs="Times New Roman"/>
+          <w:b/>
+          <w:bCs/>
+          <w:sz w:val="24"/>
+          <w:szCs w:val="24"/>
+        </w:rPr>
+        <w:t>Smart Bundle Suggestions</w:t>
+      </w:r>
+      <w:r>
+        <w:rPr>
+          <w:rFonts w:ascii="Times New Roman" w:hAnsi="Times New Roman" w:cs="Times New Roman"/>
+          <w:sz w:val="24"/>
+          <w:szCs w:val="24"/>
+        </w:rPr>
+        <w:t xml:space="preserve"> – Displays high-lift association rules (e.g., Organic Hamburger Buns with </w:t>
+      </w:r>
+      <w:proofErr w:type="spellStart"/>
+      <w:r>
+        <w:rPr>
+          <w:rFonts w:ascii="Times New Roman" w:hAnsi="Times New Roman" w:cs="Times New Roman"/>
+          <w:sz w:val="24"/>
+          <w:szCs w:val="24"/>
+        </w:rPr>
+        <w:t>Hommus</w:t>
+      </w:r>
+      <w:proofErr w:type="spellEnd"/>
+      <w:r>
+        <w:rPr>
+          <w:rFonts w:ascii="Times New Roman" w:hAnsi="Times New Roman" w:cs="Times New Roman"/>
+          <w:sz w:val="24"/>
+          <w:szCs w:val="24"/>
+        </w:rPr>
+        <w:t>)</w:t>
+      </w:r>
+    </w:p>
+    <w:p>
+      <w:pPr>
+        <w:pStyle w:val="ListParagraph"/>
+        <w:numPr>
+          <w:ilvl w:val="0"/>
+          <w:numId w:val="8"/>
+        </w:numPr>
+        <w:spacing w:before="240" w:after="0"/>
+        <w:jc w:val="both"/>
+        <w:rPr>
+          <w:rFonts w:ascii="Times New Roman" w:hAnsi="Times New Roman" w:cs="Times New Roman"/>
+          <w:sz w:val="24"/>
+          <w:szCs w:val="24"/>
+        </w:rPr>
+      </w:pPr>
+      <w:r>
+        <w:rPr>
+          <w:rFonts w:ascii="Times New Roman" w:hAnsi="Times New Roman" w:cs="Times New Roman"/>
+          <w:b/>
+          <w:bCs/>
+          <w:sz w:val="24"/>
+          <w:szCs w:val="24"/>
+        </w:rPr>
+        <w:t>ML Suitability Explanation</w:t>
+      </w:r>
+      <w:r>
+        <w:rPr>
+          <w:rFonts w:ascii="Times New Roman" w:hAnsi="Times New Roman" w:cs="Times New Roman"/>
+          <w:sz w:val="24"/>
+          <w:szCs w:val="24"/>
+        </w:rPr>
+        <w:t xml:space="preserve"> – Simple section explaining why this dataset is valuable for recommendation systems and market basket analysis.</w:t>
+      </w:r>
+    </w:p>
+    <w:p>
+      <w:pPr>
+        <w:pStyle w:val="ListParagraph"/>
+        <w:spacing w:before="240" w:after="0"/>
+        <w:jc w:val="both"/>
+        <w:rPr>
+          <w:rFonts w:ascii="Times New Roman" w:hAnsi="Times New Roman" w:cs="Times New Roman"/>
+          <w:sz w:val="24"/>
+          <w:szCs w:val="24"/>
+        </w:rPr>
+      </w:pPr>
+    </w:p>
+    <w:p>
+      <w:pPr>
+        <w:pStyle w:val="ListParagraph"/>
+        <w:spacing w:before="240" w:after="0"/>
+        <w:ind w:left="0"/>
+        <w:jc w:val="both"/>
+        <w:rPr>
+          <w:rFonts w:ascii="Times New Roman" w:hAnsi="Times New Roman" w:cs="Times New Roman"/>
+          <w:b/>
+          <w:bCs/>
+          <w:sz w:val="24"/>
+          <w:szCs w:val="24"/>
+        </w:rPr>
+      </w:pPr>
+      <w:r>
+        <w:rPr>
+          <w:rFonts w:ascii="Times New Roman" w:hAnsi="Times New Roman" w:cs="Times New Roman"/>
+          <w:b/>
+          <w:bCs/>
+          <w:sz w:val="24"/>
+          <w:szCs w:val="24"/>
+        </w:rPr>
+        <w:t>Why This Dataset is Suitable for Machine Learning in Online Retail</w:t>
+      </w:r>
+    </w:p>
+    <w:p>
+      <w:pPr>
+        <w:pStyle w:val="ListParagraph"/>
+        <w:spacing w:before="240" w:after="0"/>
+        <w:ind w:left="0"/>
+        <w:jc w:val="both"/>
+        <w:rPr>
+          <w:rFonts w:ascii="Times New Roman" w:hAnsi="Times New Roman" w:cs="Times New Roman"/>
+          <w:sz w:val="24"/>
+          <w:szCs w:val="24"/>
+        </w:rPr>
+      </w:pPr>
+      <w:r>
+        <w:rPr>
+          <w:rFonts w:ascii="Times New Roman" w:hAnsi="Times New Roman" w:cs="Times New Roman"/>
+          <w:sz w:val="24"/>
+          <w:szCs w:val="24"/>
+        </w:rPr>
+        <w:t xml:space="preserve">The </w:t>
+      </w:r>
+      <w:proofErr w:type="spellStart"/>
+      <w:r>
+        <w:rPr>
+          <w:rFonts w:ascii="Times New Roman" w:hAnsi="Times New Roman" w:cs="Times New Roman"/>
+          <w:sz w:val="24"/>
+          <w:szCs w:val="24"/>
+        </w:rPr>
+        <w:t>uchoice</w:t>
+      </w:r>
+      <w:proofErr w:type="spellEnd"/>
+      <w:r>
+        <w:rPr>
+          <w:rFonts w:ascii="Times New Roman" w:hAnsi="Times New Roman" w:cs="Times New Roman"/>
+          <w:sz w:val="24"/>
+          <w:szCs w:val="24"/>
+        </w:rPr>
+        <w:t>-Instacart dataset is highly suitable for machine learning applications in online retail. With 806,660 real shopping baskets and over 39,000 uni</w:t>
+      </w:r>
+      <w:r>
+        <w:rPr>
+          <w:rFonts w:ascii="Times New Roman" w:hAnsi="Times New Roman" w:cs="Times New Roman"/>
+          <w:sz w:val="24"/>
+          <w:szCs w:val="24"/>
+        </w:rPr>
+        <w:t>q</w:t>
+      </w:r>
+      <w:r>
+        <w:rPr>
+          <w:rFonts w:ascii="Times New Roman" w:hAnsi="Times New Roman" w:cs="Times New Roman"/>
+          <w:sz w:val="24"/>
+          <w:szCs w:val="24"/>
+        </w:rPr>
+        <w:t xml:space="preserve">ue product labels, it captures genuine consumer </w:t>
+      </w:r>
+      <w:r>
+        <w:rPr>
+          <w:rFonts w:ascii="Times New Roman" w:hAnsi="Times New Roman" w:cs="Times New Roman"/>
+          <w:sz w:val="24"/>
+          <w:szCs w:val="24"/>
+        </w:rPr>
+        <w:t>behaviour</w:t>
+      </w:r>
+      <w:r>
+        <w:rPr>
+          <w:rFonts w:ascii="Times New Roman" w:hAnsi="Times New Roman" w:cs="Times New Roman"/>
+          <w:sz w:val="24"/>
+          <w:szCs w:val="24"/>
+        </w:rPr>
+        <w:t xml:space="preserve"> in a same-day grocery delivery context.</w:t>
+      </w:r>
+    </w:p>
+    <w:p>
+      <w:pPr>
+        <w:pStyle w:val="ListParagraph"/>
+        <w:spacing w:before="240" w:after="0"/>
+        <w:ind w:left="0"/>
+        <w:jc w:val="both"/>
+        <w:rPr>
+          <w:rFonts w:ascii="Times New Roman" w:hAnsi="Times New Roman" w:cs="Times New Roman"/>
+          <w:sz w:val="24"/>
+          <w:szCs w:val="24"/>
+        </w:rPr>
+      </w:pPr>
+      <w:r>
+        <w:rPr>
+          <w:rFonts w:ascii="Times New Roman" w:hAnsi="Times New Roman" w:cs="Times New Roman"/>
+          <w:sz w:val="24"/>
+          <w:szCs w:val="24"/>
+        </w:rPr>
+        <w:t>The presence of clear co-purchase patterns supports robust collaborative filtering and association rule mining. These capabilities directly enable personalised recommendations and smart bundling strategies that can improve customer experience and increase sales conversion rates in online grocery platforms.</w:t>
+      </w:r>
+    </w:p>
+    <w:p>
+      <w:pPr>
+        <w:pStyle w:val="ListParagraph"/>
+        <w:spacing w:before="240" w:after="0"/>
+        <w:ind w:left="0"/>
+        <w:jc w:val="both"/>
+        <w:rPr>
+          <w:rFonts w:ascii="Times New Roman" w:hAnsi="Times New Roman" w:cs="Times New Roman"/>
+          <w:sz w:val="24"/>
+          <w:szCs w:val="24"/>
+        </w:rPr>
+      </w:pPr>
+      <w:r>
+        <w:rPr>
+          <w:rFonts w:ascii="Times New Roman" w:hAnsi="Times New Roman" w:cs="Times New Roman"/>
+          <w:sz w:val="24"/>
+          <w:szCs w:val="24"/>
+        </w:rPr>
+        <w:t>The restricted version (uchoice-Istacart-5-25.txt) further enhances usability by limiting basket size to a maximum of 5 items while ensuring sufficient frequency (minimum 25 occurrences per item), reducing sparsity issues common in retail data.</w:t>
+      </w:r>
+    </w:p>
+    <w:p>
+      <w:pPr>
+        <w:pStyle w:val="ListParagraph"/>
+        <w:spacing w:before="240" w:after="0"/>
+        <w:ind w:left="0"/>
+        <w:jc w:val="both"/>
+        <w:rPr>
+          <w:rFonts w:ascii="Times New Roman" w:hAnsi="Times New Roman" w:cs="Times New Roman"/>
+          <w:sz w:val="24"/>
+          <w:szCs w:val="24"/>
+        </w:rPr>
+      </w:pPr>
+    </w:p>
+    <w:p>
+      <w:pPr>
+        <w:pStyle w:val="ListParagraph"/>
+        <w:spacing w:before="240" w:after="0"/>
+        <w:ind w:left="0"/>
+        <w:jc w:val="both"/>
+        <w:rPr>
+          <w:rFonts w:ascii="Times New Roman" w:hAnsi="Times New Roman" w:cs="Times New Roman"/>
+          <w:sz w:val="24"/>
+          <w:szCs w:val="24"/>
+        </w:rPr>
+      </w:pPr>
+      <w:r>
+        <w:rPr>
+          <w:rFonts w:ascii="Times New Roman" w:hAnsi="Times New Roman" w:cs="Times New Roman"/>
+          <w:sz w:val="24"/>
+          <w:szCs w:val="24"/>
+        </w:rPr>
+        <w:t>Design Considerations for 65= Users</w:t>
+      </w:r>
+    </w:p>
+    <w:p>
+      <w:pPr>
+        <w:pStyle w:val="ListParagraph"/>
+        <w:spacing w:before="240" w:after="0"/>
+        <w:ind w:left="0"/>
+        <w:jc w:val="both"/>
+        <w:rPr>
+          <w:rFonts w:ascii="Times New Roman" w:hAnsi="Times New Roman" w:cs="Times New Roman"/>
+          <w:sz w:val="24"/>
+          <w:szCs w:val="24"/>
+        </w:rPr>
+      </w:pPr>
+      <w:r>
+        <w:rPr>
+          <w:rFonts w:ascii="Times New Roman" w:hAnsi="Times New Roman" w:cs="Times New Roman"/>
+          <w:sz w:val="24"/>
+          <w:szCs w:val="24"/>
+        </w:rPr>
+        <w:t xml:space="preserve">Special attention was given to cognitive load reduction through large text, minimal navigation, and practical </w:t>
+      </w:r>
+      <w:r>
+        <w:rPr>
+          <w:rFonts w:ascii="Times New Roman" w:hAnsi="Times New Roman" w:cs="Times New Roman"/>
+          <w:sz w:val="24"/>
+          <w:szCs w:val="24"/>
+        </w:rPr>
+        <w:t>language</w:t>
+      </w:r>
+      <w:r>
+        <w:rPr>
+          <w:rFonts w:ascii="Times New Roman" w:hAnsi="Times New Roman" w:cs="Times New Roman"/>
+          <w:sz w:val="24"/>
+          <w:szCs w:val="24"/>
+        </w:rPr>
+        <w:t xml:space="preserve"> focused on “what should I buy next” rather than technical details. High-contrast </w:t>
+      </w:r>
+      <w:r>
+        <w:rPr>
+          <w:rFonts w:ascii="Times New Roman" w:hAnsi="Times New Roman" w:cs="Times New Roman"/>
+          <w:sz w:val="24"/>
+          <w:szCs w:val="24"/>
+        </w:rPr>
+        <w:t>blue and green tones were priorities to ensure readability.</w:t>
+      </w:r>
+    </w:p>
+    <w:p>
+      <w:pPr>
+        <w:spacing w:before="240" w:after="0"/>
+        <w:jc w:val="both"/>
+        <w:rPr>
+          <w:rFonts w:ascii="Times New Roman" w:hAnsi="Times New Roman" w:cs="Times New Roman"/>
           <w:i/>
           <w:iCs/>
           <w:sz w:val="24"/>
@@ -2926,7 +4831,6 @@
           <w:sz w:val="24"/>
           <w:szCs w:val="24"/>
         </w:rPr>
-        <w:lastRenderedPageBreak/>
         <w:t>4) Discuss in detail your rationale and justification for all stages of data preparation for your visualizations.</w:t>
       </w:r>
     </w:p>
@@ -3452,7 +5356,6 @@
         <w:rPr>
           <w:color w:val="000000"/>
         </w:rPr>
-        <w:lastRenderedPageBreak/>
         <w:t>The rubric is provided for the detailed breakdown of marks at the end of this CA1.</w:t>
       </w:r>
     </w:p>
@@ -3738,6 +5641,7 @@
           <w:b/>
           <w:bCs/>
         </w:rPr>
+        <w:lastRenderedPageBreak/>
         <w:t>MLO 2 -</w:t>
       </w:r>
       <w:r>
@@ -4135,7 +6039,6 @@
         <w:rPr>
           <w:rFonts w:ascii="Arial" w:eastAsia="Arial" w:hAnsi="Arial" w:cs="Arial"/>
         </w:rPr>
-        <w:lastRenderedPageBreak/>
         <w:t>You must declare how you used AI on your assignment cover sheet.</w:t>
       </w:r>
     </w:p>
@@ -7049,6 +8952,119 @@
 <file path=word/numbering.xml><?xml version="1.0" encoding="utf-8"?>
 <w:numbering xmlns:wpc="http://schemas.microsoft.com/office/word/2010/wordprocessingCanvas" xmlns:cx="http://schemas.microsoft.com/office/drawing/2014/chartex" xmlns:cx1="http://schemas.microsoft.com/office/drawing/2015/9/8/chartex" xmlns:cx2="http://schemas.microsoft.com/office/drawing/2015/10/21/chartex" xmlns:cx3="http://schemas.microsoft.com/office/drawing/2016/5/9/chartex" xmlns:cx4="http://schemas.microsoft.com/office/drawing/2016/5/10/chartex" xmlns:cx5="http://schemas.microsoft.com/office/drawing/2016/5/11/chartex" xmlns:cx6="http://schemas.microsoft.com/office/drawing/2016/5/12/chartex" xmlns:cx7="http://schemas.microsoft.com/office/drawing/2016/5/13/chartex" xmlns:cx8="http://schemas.microsoft.com/office/drawing/2016/5/14/chartex" xmlns:mc="http://schemas.openxmlformats.org/markup-compatibility/2006" xmlns:aink="http://schemas.microsoft.com/office/drawing/2016/ink" xmlns:am3d="http://schemas.microsoft.com/office/drawing/2017/model3d" xmlns:o="urn:schemas-microsoft-com:office:office" xmlns:oel="http://schemas.microsoft.com/office/2019/extlst" xmlns:r="http://schemas.openxmlformats.org/officeDocument/2006/relationships" xmlns:m="http://schemas.openxmlformats.org/officeDocument/2006/math" xmlns:v="urn:schemas-microsoft-com:vml" xmlns:wp14="http://schemas.microsoft.com/office/word/2010/wordprocessingDrawing" xmlns:wp="http://schemas.openxmlformats.org/drawingml/2006/wordprocessingDrawing" xmlns:w10="urn:schemas-microsoft-com:office:word" xmlns:w="http://schemas.openxmlformats.org/wordprocessingml/2006/main" xmlns:w14="http://schemas.microsoft.com/office/word/2010/wordml" xmlns:w15="http://schemas.microsoft.com/office/word/2012/wordml" xmlns:w16cex="http://schemas.microsoft.com/office/word/2018/wordml/cex" xmlns:w16cid="http://schemas.microsoft.com/office/word/2016/wordml/cid" xmlns:w16="http://schemas.microsoft.com/office/word/2018/wordml" xmlns:w16du="http://schemas.microsoft.com/office/word/2023/wordml/word16du" xmlns:w16sdtdh="http://schemas.microsoft.com/office/word/2020/wordml/sdtdatahash" xmlns:w16sdtfl="http://schemas.microsoft.com/office/word/2024/wordml/sdtformatlock" xmlns:w16se="http://schemas.microsoft.com/office/word/2015/wordml/symex" xmlns:wpg="http://schemas.microsoft.com/office/word/2010/wordprocessingGroup" xmlns:wpi="http://schemas.microsoft.com/office/word/2010/wordprocessingInk" xmlns:wne="http://schemas.microsoft.com/office/word/2006/wordml" xmlns:wps="http://schemas.microsoft.com/office/word/2010/wordprocessingShape" mc:Ignorable="w14 w15 w16se w16cid w16 w16cex w16sdtdh w16sdtfl w16du wp14">
   <w:abstractNum w:abstractNumId="0" w15:restartNumberingAfterBreak="0">
+    <w:nsid w:val="076441EA"/>
+    <w:multiLevelType w:val="hybridMultilevel"/>
+    <w:tmpl w:val="C748A5A0"/>
+    <w:lvl w:ilvl="0" w:tplc="18090009">
+      <w:start w:val="1"/>
+      <w:numFmt w:val="bullet"/>
+      <w:lvlText w:val=""/>
+      <w:lvlJc w:val="left"/>
+      <w:pPr>
+        <w:ind w:left="1440" w:hanging="360"/>
+      </w:pPr>
+      <w:rPr>
+        <w:rFonts w:ascii="Wingdings" w:hAnsi="Wingdings" w:hint="default"/>
+      </w:rPr>
+    </w:lvl>
+    <w:lvl w:ilvl="1" w:tplc="FFFFFFFF" w:tentative="1">
+      <w:start w:val="1"/>
+      <w:numFmt w:val="bullet"/>
+      <w:lvlText w:val="o"/>
+      <w:lvlJc w:val="left"/>
+      <w:pPr>
+        <w:ind w:left="2160" w:hanging="360"/>
+      </w:pPr>
+      <w:rPr>
+        <w:rFonts w:ascii="Courier New" w:hAnsi="Courier New" w:cs="Courier New" w:hint="default"/>
+      </w:rPr>
+    </w:lvl>
+    <w:lvl w:ilvl="2" w:tplc="FFFFFFFF" w:tentative="1">
+      <w:start w:val="1"/>
+      <w:numFmt w:val="bullet"/>
+      <w:lvlText w:val=""/>
+      <w:lvlJc w:val="left"/>
+      <w:pPr>
+        <w:ind w:left="2880" w:hanging="360"/>
+      </w:pPr>
+      <w:rPr>
+        <w:rFonts w:ascii="Wingdings" w:hAnsi="Wingdings" w:hint="default"/>
+      </w:rPr>
+    </w:lvl>
+    <w:lvl w:ilvl="3" w:tplc="FFFFFFFF" w:tentative="1">
+      <w:start w:val="1"/>
+      <w:numFmt w:val="bullet"/>
+      <w:lvlText w:val=""/>
+      <w:lvlJc w:val="left"/>
+      <w:pPr>
+        <w:ind w:left="3600" w:hanging="360"/>
+      </w:pPr>
+      <w:rPr>
+        <w:rFonts w:ascii="Symbol" w:hAnsi="Symbol" w:hint="default"/>
+      </w:rPr>
+    </w:lvl>
+    <w:lvl w:ilvl="4" w:tplc="FFFFFFFF" w:tentative="1">
+      <w:start w:val="1"/>
+      <w:numFmt w:val="bullet"/>
+      <w:lvlText w:val="o"/>
+      <w:lvlJc w:val="left"/>
+      <w:pPr>
+        <w:ind w:left="4320" w:hanging="360"/>
+      </w:pPr>
+      <w:rPr>
+        <w:rFonts w:ascii="Courier New" w:hAnsi="Courier New" w:cs="Courier New" w:hint="default"/>
+      </w:rPr>
+    </w:lvl>
+    <w:lvl w:ilvl="5" w:tplc="FFFFFFFF" w:tentative="1">
+      <w:start w:val="1"/>
+      <w:numFmt w:val="bullet"/>
+      <w:lvlText w:val=""/>
+      <w:lvlJc w:val="left"/>
+      <w:pPr>
+        <w:ind w:left="5040" w:hanging="360"/>
+      </w:pPr>
+      <w:rPr>
+        <w:rFonts w:ascii="Wingdings" w:hAnsi="Wingdings" w:hint="default"/>
+      </w:rPr>
+    </w:lvl>
+    <w:lvl w:ilvl="6" w:tplc="FFFFFFFF" w:tentative="1">
+      <w:start w:val="1"/>
+      <w:numFmt w:val="bullet"/>
+      <w:lvlText w:val=""/>
+      <w:lvlJc w:val="left"/>
+      <w:pPr>
+        <w:ind w:left="5760" w:hanging="360"/>
+      </w:pPr>
+      <w:rPr>
+        <w:rFonts w:ascii="Symbol" w:hAnsi="Symbol" w:hint="default"/>
+      </w:rPr>
+    </w:lvl>
+    <w:lvl w:ilvl="7" w:tplc="FFFFFFFF" w:tentative="1">
+      <w:start w:val="1"/>
+      <w:numFmt w:val="bullet"/>
+      <w:lvlText w:val="o"/>
+      <w:lvlJc w:val="left"/>
+      <w:pPr>
+        <w:ind w:left="6480" w:hanging="360"/>
+      </w:pPr>
+      <w:rPr>
+        <w:rFonts w:ascii="Courier New" w:hAnsi="Courier New" w:cs="Courier New" w:hint="default"/>
+      </w:rPr>
+    </w:lvl>
+    <w:lvl w:ilvl="8" w:tplc="FFFFFFFF" w:tentative="1">
+      <w:start w:val="1"/>
+      <w:numFmt w:val="bullet"/>
+      <w:lvlText w:val=""/>
+      <w:lvlJc w:val="left"/>
+      <w:pPr>
+        <w:ind w:left="7200" w:hanging="360"/>
+      </w:pPr>
+      <w:rPr>
+        <w:rFonts w:ascii="Wingdings" w:hAnsi="Wingdings" w:hint="default"/>
+      </w:rPr>
+    </w:lvl>
+  </w:abstractNum>
+  <w:abstractNum w:abstractNumId="1" w15:restartNumberingAfterBreak="0">
     <w:nsid w:val="0D8273CB"/>
     <w:multiLevelType w:val="multilevel"/>
     <w:tmpl w:val="1DACC570"/>
@@ -7161,7 +9177,7 @@
       </w:rPr>
     </w:lvl>
   </w:abstractNum>
-  <w:abstractNum w:abstractNumId="1" w15:restartNumberingAfterBreak="0">
+  <w:abstractNum w:abstractNumId="2" w15:restartNumberingAfterBreak="0">
     <w:nsid w:val="134B551A"/>
     <w:multiLevelType w:val="multilevel"/>
     <w:tmpl w:val="3342FAEE"/>
@@ -7274,7 +9290,7 @@
       </w:rPr>
     </w:lvl>
   </w:abstractNum>
-  <w:abstractNum w:abstractNumId="2" w15:restartNumberingAfterBreak="0">
+  <w:abstractNum w:abstractNumId="3" w15:restartNumberingAfterBreak="0">
     <w:nsid w:val="2BC0183B"/>
     <w:multiLevelType w:val="hybridMultilevel"/>
     <w:tmpl w:val="10C6ED48"/>
@@ -7387,7 +9403,233 @@
       </w:rPr>
     </w:lvl>
   </w:abstractNum>
-  <w:abstractNum w:abstractNumId="3" w15:restartNumberingAfterBreak="0">
+  <w:abstractNum w:abstractNumId="4" w15:restartNumberingAfterBreak="0">
+    <w:nsid w:val="2CA73F80"/>
+    <w:multiLevelType w:val="hybridMultilevel"/>
+    <w:tmpl w:val="C1603B0C"/>
+    <w:lvl w:ilvl="0" w:tplc="18090001">
+      <w:start w:val="1"/>
+      <w:numFmt w:val="bullet"/>
+      <w:lvlText w:val=""/>
+      <w:lvlJc w:val="left"/>
+      <w:pPr>
+        <w:ind w:left="1440" w:hanging="360"/>
+      </w:pPr>
+      <w:rPr>
+        <w:rFonts w:ascii="Symbol" w:hAnsi="Symbol" w:hint="default"/>
+      </w:rPr>
+    </w:lvl>
+    <w:lvl w:ilvl="1" w:tplc="18090003" w:tentative="1">
+      <w:start w:val="1"/>
+      <w:numFmt w:val="bullet"/>
+      <w:lvlText w:val="o"/>
+      <w:lvlJc w:val="left"/>
+      <w:pPr>
+        <w:ind w:left="2160" w:hanging="360"/>
+      </w:pPr>
+      <w:rPr>
+        <w:rFonts w:ascii="Courier New" w:hAnsi="Courier New" w:cs="Courier New" w:hint="default"/>
+      </w:rPr>
+    </w:lvl>
+    <w:lvl w:ilvl="2" w:tplc="18090005" w:tentative="1">
+      <w:start w:val="1"/>
+      <w:numFmt w:val="bullet"/>
+      <w:lvlText w:val=""/>
+      <w:lvlJc w:val="left"/>
+      <w:pPr>
+        <w:ind w:left="2880" w:hanging="360"/>
+      </w:pPr>
+      <w:rPr>
+        <w:rFonts w:ascii="Wingdings" w:hAnsi="Wingdings" w:hint="default"/>
+      </w:rPr>
+    </w:lvl>
+    <w:lvl w:ilvl="3" w:tplc="18090001" w:tentative="1">
+      <w:start w:val="1"/>
+      <w:numFmt w:val="bullet"/>
+      <w:lvlText w:val=""/>
+      <w:lvlJc w:val="left"/>
+      <w:pPr>
+        <w:ind w:left="3600" w:hanging="360"/>
+      </w:pPr>
+      <w:rPr>
+        <w:rFonts w:ascii="Symbol" w:hAnsi="Symbol" w:hint="default"/>
+      </w:rPr>
+    </w:lvl>
+    <w:lvl w:ilvl="4" w:tplc="18090003" w:tentative="1">
+      <w:start w:val="1"/>
+      <w:numFmt w:val="bullet"/>
+      <w:lvlText w:val="o"/>
+      <w:lvlJc w:val="left"/>
+      <w:pPr>
+        <w:ind w:left="4320" w:hanging="360"/>
+      </w:pPr>
+      <w:rPr>
+        <w:rFonts w:ascii="Courier New" w:hAnsi="Courier New" w:cs="Courier New" w:hint="default"/>
+      </w:rPr>
+    </w:lvl>
+    <w:lvl w:ilvl="5" w:tplc="18090005" w:tentative="1">
+      <w:start w:val="1"/>
+      <w:numFmt w:val="bullet"/>
+      <w:lvlText w:val=""/>
+      <w:lvlJc w:val="left"/>
+      <w:pPr>
+        <w:ind w:left="5040" w:hanging="360"/>
+      </w:pPr>
+      <w:rPr>
+        <w:rFonts w:ascii="Wingdings" w:hAnsi="Wingdings" w:hint="default"/>
+      </w:rPr>
+    </w:lvl>
+    <w:lvl w:ilvl="6" w:tplc="18090001" w:tentative="1">
+      <w:start w:val="1"/>
+      <w:numFmt w:val="bullet"/>
+      <w:lvlText w:val=""/>
+      <w:lvlJc w:val="left"/>
+      <w:pPr>
+        <w:ind w:left="5760" w:hanging="360"/>
+      </w:pPr>
+      <w:rPr>
+        <w:rFonts w:ascii="Symbol" w:hAnsi="Symbol" w:hint="default"/>
+      </w:rPr>
+    </w:lvl>
+    <w:lvl w:ilvl="7" w:tplc="18090003" w:tentative="1">
+      <w:start w:val="1"/>
+      <w:numFmt w:val="bullet"/>
+      <w:lvlText w:val="o"/>
+      <w:lvlJc w:val="left"/>
+      <w:pPr>
+        <w:ind w:left="6480" w:hanging="360"/>
+      </w:pPr>
+      <w:rPr>
+        <w:rFonts w:ascii="Courier New" w:hAnsi="Courier New" w:cs="Courier New" w:hint="default"/>
+      </w:rPr>
+    </w:lvl>
+    <w:lvl w:ilvl="8" w:tplc="18090005" w:tentative="1">
+      <w:start w:val="1"/>
+      <w:numFmt w:val="bullet"/>
+      <w:lvlText w:val=""/>
+      <w:lvlJc w:val="left"/>
+      <w:pPr>
+        <w:ind w:left="7200" w:hanging="360"/>
+      </w:pPr>
+      <w:rPr>
+        <w:rFonts w:ascii="Wingdings" w:hAnsi="Wingdings" w:hint="default"/>
+      </w:rPr>
+    </w:lvl>
+  </w:abstractNum>
+  <w:abstractNum w:abstractNumId="5" w15:restartNumberingAfterBreak="0">
+    <w:nsid w:val="31856544"/>
+    <w:multiLevelType w:val="hybridMultilevel"/>
+    <w:tmpl w:val="77F45400"/>
+    <w:lvl w:ilvl="0" w:tplc="18090001">
+      <w:start w:val="1"/>
+      <w:numFmt w:val="bullet"/>
+      <w:lvlText w:val=""/>
+      <w:lvlJc w:val="left"/>
+      <w:pPr>
+        <w:ind w:left="720" w:hanging="360"/>
+      </w:pPr>
+      <w:rPr>
+        <w:rFonts w:ascii="Symbol" w:hAnsi="Symbol" w:hint="default"/>
+      </w:rPr>
+    </w:lvl>
+    <w:lvl w:ilvl="1" w:tplc="18090003" w:tentative="1">
+      <w:start w:val="1"/>
+      <w:numFmt w:val="bullet"/>
+      <w:lvlText w:val="o"/>
+      <w:lvlJc w:val="left"/>
+      <w:pPr>
+        <w:ind w:left="1440" w:hanging="360"/>
+      </w:pPr>
+      <w:rPr>
+        <w:rFonts w:ascii="Courier New" w:hAnsi="Courier New" w:cs="Courier New" w:hint="default"/>
+      </w:rPr>
+    </w:lvl>
+    <w:lvl w:ilvl="2" w:tplc="18090005" w:tentative="1">
+      <w:start w:val="1"/>
+      <w:numFmt w:val="bullet"/>
+      <w:lvlText w:val=""/>
+      <w:lvlJc w:val="left"/>
+      <w:pPr>
+        <w:ind w:left="2160" w:hanging="360"/>
+      </w:pPr>
+      <w:rPr>
+        <w:rFonts w:ascii="Wingdings" w:hAnsi="Wingdings" w:hint="default"/>
+      </w:rPr>
+    </w:lvl>
+    <w:lvl w:ilvl="3" w:tplc="18090001" w:tentative="1">
+      <w:start w:val="1"/>
+      <w:numFmt w:val="bullet"/>
+      <w:lvlText w:val=""/>
+      <w:lvlJc w:val="left"/>
+      <w:pPr>
+        <w:ind w:left="2880" w:hanging="360"/>
+      </w:pPr>
+      <w:rPr>
+        <w:rFonts w:ascii="Symbol" w:hAnsi="Symbol" w:hint="default"/>
+      </w:rPr>
+    </w:lvl>
+    <w:lvl w:ilvl="4" w:tplc="18090003" w:tentative="1">
+      <w:start w:val="1"/>
+      <w:numFmt w:val="bullet"/>
+      <w:lvlText w:val="o"/>
+      <w:lvlJc w:val="left"/>
+      <w:pPr>
+        <w:ind w:left="3600" w:hanging="360"/>
+      </w:pPr>
+      <w:rPr>
+        <w:rFonts w:ascii="Courier New" w:hAnsi="Courier New" w:cs="Courier New" w:hint="default"/>
+      </w:rPr>
+    </w:lvl>
+    <w:lvl w:ilvl="5" w:tplc="18090005" w:tentative="1">
+      <w:start w:val="1"/>
+      <w:numFmt w:val="bullet"/>
+      <w:lvlText w:val=""/>
+      <w:lvlJc w:val="left"/>
+      <w:pPr>
+        <w:ind w:left="4320" w:hanging="360"/>
+      </w:pPr>
+      <w:rPr>
+        <w:rFonts w:ascii="Wingdings" w:hAnsi="Wingdings" w:hint="default"/>
+      </w:rPr>
+    </w:lvl>
+    <w:lvl w:ilvl="6" w:tplc="18090001" w:tentative="1">
+      <w:start w:val="1"/>
+      <w:numFmt w:val="bullet"/>
+      <w:lvlText w:val=""/>
+      <w:lvlJc w:val="left"/>
+      <w:pPr>
+        <w:ind w:left="5040" w:hanging="360"/>
+      </w:pPr>
+      <w:rPr>
+        <w:rFonts w:ascii="Symbol" w:hAnsi="Symbol" w:hint="default"/>
+      </w:rPr>
+    </w:lvl>
+    <w:lvl w:ilvl="7" w:tplc="18090003" w:tentative="1">
+      <w:start w:val="1"/>
+      <w:numFmt w:val="bullet"/>
+      <w:lvlText w:val="o"/>
+      <w:lvlJc w:val="left"/>
+      <w:pPr>
+        <w:ind w:left="5760" w:hanging="360"/>
+      </w:pPr>
+      <w:rPr>
+        <w:rFonts w:ascii="Courier New" w:hAnsi="Courier New" w:cs="Courier New" w:hint="default"/>
+      </w:rPr>
+    </w:lvl>
+    <w:lvl w:ilvl="8" w:tplc="18090005" w:tentative="1">
+      <w:start w:val="1"/>
+      <w:numFmt w:val="bullet"/>
+      <w:lvlText w:val=""/>
+      <w:lvlJc w:val="left"/>
+      <w:pPr>
+        <w:ind w:left="6480" w:hanging="360"/>
+      </w:pPr>
+      <w:rPr>
+        <w:rFonts w:ascii="Wingdings" w:hAnsi="Wingdings" w:hint="default"/>
+      </w:rPr>
+    </w:lvl>
+  </w:abstractNum>
+  <w:abstractNum w:abstractNumId="6" w15:restartNumberingAfterBreak="0">
     <w:nsid w:val="35AD78C4"/>
     <w:multiLevelType w:val="multilevel"/>
     <w:tmpl w:val="D01EC80A"/>
@@ -7500,7 +9742,120 @@
       </w:rPr>
     </w:lvl>
   </w:abstractNum>
-  <w:abstractNum w:abstractNumId="4" w15:restartNumberingAfterBreak="0">
+  <w:abstractNum w:abstractNumId="7" w15:restartNumberingAfterBreak="0">
+    <w:nsid w:val="36C30F76"/>
+    <w:multiLevelType w:val="hybridMultilevel"/>
+    <w:tmpl w:val="B7AA7794"/>
+    <w:lvl w:ilvl="0" w:tplc="18090001">
+      <w:start w:val="1"/>
+      <w:numFmt w:val="bullet"/>
+      <w:lvlText w:val=""/>
+      <w:lvlJc w:val="left"/>
+      <w:pPr>
+        <w:ind w:left="720" w:hanging="360"/>
+      </w:pPr>
+      <w:rPr>
+        <w:rFonts w:ascii="Symbol" w:hAnsi="Symbol" w:hint="default"/>
+      </w:rPr>
+    </w:lvl>
+    <w:lvl w:ilvl="1" w:tplc="18090003">
+      <w:start w:val="1"/>
+      <w:numFmt w:val="bullet"/>
+      <w:lvlText w:val="o"/>
+      <w:lvlJc w:val="left"/>
+      <w:pPr>
+        <w:ind w:left="1440" w:hanging="360"/>
+      </w:pPr>
+      <w:rPr>
+        <w:rFonts w:ascii="Courier New" w:hAnsi="Courier New" w:cs="Courier New" w:hint="default"/>
+      </w:rPr>
+    </w:lvl>
+    <w:lvl w:ilvl="2" w:tplc="18090005" w:tentative="1">
+      <w:start w:val="1"/>
+      <w:numFmt w:val="bullet"/>
+      <w:lvlText w:val=""/>
+      <w:lvlJc w:val="left"/>
+      <w:pPr>
+        <w:ind w:left="2160" w:hanging="360"/>
+      </w:pPr>
+      <w:rPr>
+        <w:rFonts w:ascii="Wingdings" w:hAnsi="Wingdings" w:hint="default"/>
+      </w:rPr>
+    </w:lvl>
+    <w:lvl w:ilvl="3" w:tplc="18090001" w:tentative="1">
+      <w:start w:val="1"/>
+      <w:numFmt w:val="bullet"/>
+      <w:lvlText w:val=""/>
+      <w:lvlJc w:val="left"/>
+      <w:pPr>
+        <w:ind w:left="2880" w:hanging="360"/>
+      </w:pPr>
+      <w:rPr>
+        <w:rFonts w:ascii="Symbol" w:hAnsi="Symbol" w:hint="default"/>
+      </w:rPr>
+    </w:lvl>
+    <w:lvl w:ilvl="4" w:tplc="18090003" w:tentative="1">
+      <w:start w:val="1"/>
+      <w:numFmt w:val="bullet"/>
+      <w:lvlText w:val="o"/>
+      <w:lvlJc w:val="left"/>
+      <w:pPr>
+        <w:ind w:left="3600" w:hanging="360"/>
+      </w:pPr>
+      <w:rPr>
+        <w:rFonts w:ascii="Courier New" w:hAnsi="Courier New" w:cs="Courier New" w:hint="default"/>
+      </w:rPr>
+    </w:lvl>
+    <w:lvl w:ilvl="5" w:tplc="18090005" w:tentative="1">
+      <w:start w:val="1"/>
+      <w:numFmt w:val="bullet"/>
+      <w:lvlText w:val=""/>
+      <w:lvlJc w:val="left"/>
+      <w:pPr>
+        <w:ind w:left="4320" w:hanging="360"/>
+      </w:pPr>
+      <w:rPr>
+        <w:rFonts w:ascii="Wingdings" w:hAnsi="Wingdings" w:hint="default"/>
+      </w:rPr>
+    </w:lvl>
+    <w:lvl w:ilvl="6" w:tplc="18090001" w:tentative="1">
+      <w:start w:val="1"/>
+      <w:numFmt w:val="bullet"/>
+      <w:lvlText w:val=""/>
+      <w:lvlJc w:val="left"/>
+      <w:pPr>
+        <w:ind w:left="5040" w:hanging="360"/>
+      </w:pPr>
+      <w:rPr>
+        <w:rFonts w:ascii="Symbol" w:hAnsi="Symbol" w:hint="default"/>
+      </w:rPr>
+    </w:lvl>
+    <w:lvl w:ilvl="7" w:tplc="18090003" w:tentative="1">
+      <w:start w:val="1"/>
+      <w:numFmt w:val="bullet"/>
+      <w:lvlText w:val="o"/>
+      <w:lvlJc w:val="left"/>
+      <w:pPr>
+        <w:ind w:left="5760" w:hanging="360"/>
+      </w:pPr>
+      <w:rPr>
+        <w:rFonts w:ascii="Courier New" w:hAnsi="Courier New" w:cs="Courier New" w:hint="default"/>
+      </w:rPr>
+    </w:lvl>
+    <w:lvl w:ilvl="8" w:tplc="18090005" w:tentative="1">
+      <w:start w:val="1"/>
+      <w:numFmt w:val="bullet"/>
+      <w:lvlText w:val=""/>
+      <w:lvlJc w:val="left"/>
+      <w:pPr>
+        <w:ind w:left="6480" w:hanging="360"/>
+      </w:pPr>
+      <w:rPr>
+        <w:rFonts w:ascii="Wingdings" w:hAnsi="Wingdings" w:hint="default"/>
+      </w:rPr>
+    </w:lvl>
+  </w:abstractNum>
+  <w:abstractNum w:abstractNumId="8" w15:restartNumberingAfterBreak="0">
     <w:nsid w:val="419C4748"/>
     <w:multiLevelType w:val="hybridMultilevel"/>
     <w:tmpl w:val="A9AA5DE0"/>
@@ -7613,7 +9968,208 @@
       </w:rPr>
     </w:lvl>
   </w:abstractNum>
-  <w:abstractNum w:abstractNumId="5" w15:restartNumberingAfterBreak="0">
+  <w:abstractNum w:abstractNumId="9" w15:restartNumberingAfterBreak="0">
+    <w:nsid w:val="482C75FB"/>
+    <w:multiLevelType w:val="hybridMultilevel"/>
+    <w:tmpl w:val="7DF25386"/>
+    <w:lvl w:ilvl="0" w:tplc="3F6A2E38">
+      <w:numFmt w:val="decimal"/>
+      <w:lvlText w:val="%1"/>
+      <w:lvlJc w:val="left"/>
+      <w:pPr>
+        <w:ind w:left="1440" w:hanging="720"/>
+      </w:pPr>
+      <w:rPr>
+        <w:rFonts w:hint="default"/>
+      </w:rPr>
+    </w:lvl>
+    <w:lvl w:ilvl="1" w:tplc="18090019" w:tentative="1">
+      <w:start w:val="1"/>
+      <w:numFmt w:val="lowerLetter"/>
+      <w:lvlText w:val="%2."/>
+      <w:lvlJc w:val="left"/>
+      <w:pPr>
+        <w:ind w:left="1800" w:hanging="360"/>
+      </w:pPr>
+    </w:lvl>
+    <w:lvl w:ilvl="2" w:tplc="1809001B" w:tentative="1">
+      <w:start w:val="1"/>
+      <w:numFmt w:val="lowerRoman"/>
+      <w:lvlText w:val="%3."/>
+      <w:lvlJc w:val="right"/>
+      <w:pPr>
+        <w:ind w:left="2520" w:hanging="180"/>
+      </w:pPr>
+    </w:lvl>
+    <w:lvl w:ilvl="3" w:tplc="1809000F" w:tentative="1">
+      <w:start w:val="1"/>
+      <w:numFmt w:val="decimal"/>
+      <w:lvlText w:val="%4."/>
+      <w:lvlJc w:val="left"/>
+      <w:pPr>
+        <w:ind w:left="3240" w:hanging="360"/>
+      </w:pPr>
+    </w:lvl>
+    <w:lvl w:ilvl="4" w:tplc="18090019" w:tentative="1">
+      <w:start w:val="1"/>
+      <w:numFmt w:val="lowerLetter"/>
+      <w:lvlText w:val="%5."/>
+      <w:lvlJc w:val="left"/>
+      <w:pPr>
+        <w:ind w:left="3960" w:hanging="360"/>
+      </w:pPr>
+    </w:lvl>
+    <w:lvl w:ilvl="5" w:tplc="1809001B" w:tentative="1">
+      <w:start w:val="1"/>
+      <w:numFmt w:val="lowerRoman"/>
+      <w:lvlText w:val="%6."/>
+      <w:lvlJc w:val="right"/>
+      <w:pPr>
+        <w:ind w:left="4680" w:hanging="180"/>
+      </w:pPr>
+    </w:lvl>
+    <w:lvl w:ilvl="6" w:tplc="1809000F" w:tentative="1">
+      <w:start w:val="1"/>
+      <w:numFmt w:val="decimal"/>
+      <w:lvlText w:val="%7."/>
+      <w:lvlJc w:val="left"/>
+      <w:pPr>
+        <w:ind w:left="5400" w:hanging="360"/>
+      </w:pPr>
+    </w:lvl>
+    <w:lvl w:ilvl="7" w:tplc="18090019" w:tentative="1">
+      <w:start w:val="1"/>
+      <w:numFmt w:val="lowerLetter"/>
+      <w:lvlText w:val="%8."/>
+      <w:lvlJc w:val="left"/>
+      <w:pPr>
+        <w:ind w:left="6120" w:hanging="360"/>
+      </w:pPr>
+    </w:lvl>
+    <w:lvl w:ilvl="8" w:tplc="1809001B" w:tentative="1">
+      <w:start w:val="1"/>
+      <w:numFmt w:val="lowerRoman"/>
+      <w:lvlText w:val="%9."/>
+      <w:lvlJc w:val="right"/>
+      <w:pPr>
+        <w:ind w:left="6840" w:hanging="180"/>
+      </w:pPr>
+    </w:lvl>
+  </w:abstractNum>
+  <w:abstractNum w:abstractNumId="10" w15:restartNumberingAfterBreak="0">
+    <w:nsid w:val="4ABC60CE"/>
+    <w:multiLevelType w:val="hybridMultilevel"/>
+    <w:tmpl w:val="A964F7BE"/>
+    <w:lvl w:ilvl="0" w:tplc="18090009">
+      <w:start w:val="1"/>
+      <w:numFmt w:val="bullet"/>
+      <w:lvlText w:val=""/>
+      <w:lvlJc w:val="left"/>
+      <w:pPr>
+        <w:ind w:left="1440" w:hanging="360"/>
+      </w:pPr>
+      <w:rPr>
+        <w:rFonts w:ascii="Wingdings" w:hAnsi="Wingdings" w:hint="default"/>
+      </w:rPr>
+    </w:lvl>
+    <w:lvl w:ilvl="1" w:tplc="FFFFFFFF" w:tentative="1">
+      <w:start w:val="1"/>
+      <w:numFmt w:val="bullet"/>
+      <w:lvlText w:val="o"/>
+      <w:lvlJc w:val="left"/>
+      <w:pPr>
+        <w:ind w:left="2160" w:hanging="360"/>
+      </w:pPr>
+      <w:rPr>
+        <w:rFonts w:ascii="Courier New" w:hAnsi="Courier New" w:cs="Courier New" w:hint="default"/>
+      </w:rPr>
+    </w:lvl>
+    <w:lvl w:ilvl="2" w:tplc="FFFFFFFF" w:tentative="1">
+      <w:start w:val="1"/>
+      <w:numFmt w:val="bullet"/>
+      <w:lvlText w:val=""/>
+      <w:lvlJc w:val="left"/>
+      <w:pPr>
+        <w:ind w:left="2880" w:hanging="360"/>
+      </w:pPr>
+      <w:rPr>
+        <w:rFonts w:ascii="Wingdings" w:hAnsi="Wingdings" w:hint="default"/>
+      </w:rPr>
+    </w:lvl>
+    <w:lvl w:ilvl="3" w:tplc="FFFFFFFF" w:tentative="1">
+      <w:start w:val="1"/>
+      <w:numFmt w:val="bullet"/>
+      <w:lvlText w:val=""/>
+      <w:lvlJc w:val="left"/>
+      <w:pPr>
+        <w:ind w:left="3600" w:hanging="360"/>
+      </w:pPr>
+      <w:rPr>
+        <w:rFonts w:ascii="Symbol" w:hAnsi="Symbol" w:hint="default"/>
+      </w:rPr>
+    </w:lvl>
+    <w:lvl w:ilvl="4" w:tplc="FFFFFFFF" w:tentative="1">
+      <w:start w:val="1"/>
+      <w:numFmt w:val="bullet"/>
+      <w:lvlText w:val="o"/>
+      <w:lvlJc w:val="left"/>
+      <w:pPr>
+        <w:ind w:left="4320" w:hanging="360"/>
+      </w:pPr>
+      <w:rPr>
+        <w:rFonts w:ascii="Courier New" w:hAnsi="Courier New" w:cs="Courier New" w:hint="default"/>
+      </w:rPr>
+    </w:lvl>
+    <w:lvl w:ilvl="5" w:tplc="FFFFFFFF" w:tentative="1">
+      <w:start w:val="1"/>
+      <w:numFmt w:val="bullet"/>
+      <w:lvlText w:val=""/>
+      <w:lvlJc w:val="left"/>
+      <w:pPr>
+        <w:ind w:left="5040" w:hanging="360"/>
+      </w:pPr>
+      <w:rPr>
+        <w:rFonts w:ascii="Wingdings" w:hAnsi="Wingdings" w:hint="default"/>
+      </w:rPr>
+    </w:lvl>
+    <w:lvl w:ilvl="6" w:tplc="FFFFFFFF" w:tentative="1">
+      <w:start w:val="1"/>
+      <w:numFmt w:val="bullet"/>
+      <w:lvlText w:val=""/>
+      <w:lvlJc w:val="left"/>
+      <w:pPr>
+        <w:ind w:left="5760" w:hanging="360"/>
+      </w:pPr>
+      <w:rPr>
+        <w:rFonts w:ascii="Symbol" w:hAnsi="Symbol" w:hint="default"/>
+      </w:rPr>
+    </w:lvl>
+    <w:lvl w:ilvl="7" w:tplc="FFFFFFFF" w:tentative="1">
+      <w:start w:val="1"/>
+      <w:numFmt w:val="bullet"/>
+      <w:lvlText w:val="o"/>
+      <w:lvlJc w:val="left"/>
+      <w:pPr>
+        <w:ind w:left="6480" w:hanging="360"/>
+      </w:pPr>
+      <w:rPr>
+        <w:rFonts w:ascii="Courier New" w:hAnsi="Courier New" w:cs="Courier New" w:hint="default"/>
+      </w:rPr>
+    </w:lvl>
+    <w:lvl w:ilvl="8" w:tplc="FFFFFFFF" w:tentative="1">
+      <w:start w:val="1"/>
+      <w:numFmt w:val="bullet"/>
+      <w:lvlText w:val=""/>
+      <w:lvlJc w:val="left"/>
+      <w:pPr>
+        <w:ind w:left="7200" w:hanging="360"/>
+      </w:pPr>
+      <w:rPr>
+        <w:rFonts w:ascii="Wingdings" w:hAnsi="Wingdings" w:hint="default"/>
+      </w:rPr>
+    </w:lvl>
+  </w:abstractNum>
+  <w:abstractNum w:abstractNumId="11" w15:restartNumberingAfterBreak="0">
     <w:nsid w:val="4D5E62E1"/>
     <w:multiLevelType w:val="multilevel"/>
     <w:tmpl w:val="1B30457C"/>
@@ -7726,7 +10282,233 @@
       </w:rPr>
     </w:lvl>
   </w:abstractNum>
-  <w:abstractNum w:abstractNumId="6" w15:restartNumberingAfterBreak="0">
+  <w:abstractNum w:abstractNumId="12" w15:restartNumberingAfterBreak="0">
+    <w:nsid w:val="650B333A"/>
+    <w:multiLevelType w:val="hybridMultilevel"/>
+    <w:tmpl w:val="D208032C"/>
+    <w:lvl w:ilvl="0" w:tplc="18090001">
+      <w:start w:val="1"/>
+      <w:numFmt w:val="bullet"/>
+      <w:lvlText w:val=""/>
+      <w:lvlJc w:val="left"/>
+      <w:pPr>
+        <w:ind w:left="1440" w:hanging="360"/>
+      </w:pPr>
+      <w:rPr>
+        <w:rFonts w:ascii="Symbol" w:hAnsi="Symbol" w:hint="default"/>
+      </w:rPr>
+    </w:lvl>
+    <w:lvl w:ilvl="1" w:tplc="18090003" w:tentative="1">
+      <w:start w:val="1"/>
+      <w:numFmt w:val="bullet"/>
+      <w:lvlText w:val="o"/>
+      <w:lvlJc w:val="left"/>
+      <w:pPr>
+        <w:ind w:left="2160" w:hanging="360"/>
+      </w:pPr>
+      <w:rPr>
+        <w:rFonts w:ascii="Courier New" w:hAnsi="Courier New" w:cs="Courier New" w:hint="default"/>
+      </w:rPr>
+    </w:lvl>
+    <w:lvl w:ilvl="2" w:tplc="18090005" w:tentative="1">
+      <w:start w:val="1"/>
+      <w:numFmt w:val="bullet"/>
+      <w:lvlText w:val=""/>
+      <w:lvlJc w:val="left"/>
+      <w:pPr>
+        <w:ind w:left="2880" w:hanging="360"/>
+      </w:pPr>
+      <w:rPr>
+        <w:rFonts w:ascii="Wingdings" w:hAnsi="Wingdings" w:hint="default"/>
+      </w:rPr>
+    </w:lvl>
+    <w:lvl w:ilvl="3" w:tplc="18090001" w:tentative="1">
+      <w:start w:val="1"/>
+      <w:numFmt w:val="bullet"/>
+      <w:lvlText w:val=""/>
+      <w:lvlJc w:val="left"/>
+      <w:pPr>
+        <w:ind w:left="3600" w:hanging="360"/>
+      </w:pPr>
+      <w:rPr>
+        <w:rFonts w:ascii="Symbol" w:hAnsi="Symbol" w:hint="default"/>
+      </w:rPr>
+    </w:lvl>
+    <w:lvl w:ilvl="4" w:tplc="18090003" w:tentative="1">
+      <w:start w:val="1"/>
+      <w:numFmt w:val="bullet"/>
+      <w:lvlText w:val="o"/>
+      <w:lvlJc w:val="left"/>
+      <w:pPr>
+        <w:ind w:left="4320" w:hanging="360"/>
+      </w:pPr>
+      <w:rPr>
+        <w:rFonts w:ascii="Courier New" w:hAnsi="Courier New" w:cs="Courier New" w:hint="default"/>
+      </w:rPr>
+    </w:lvl>
+    <w:lvl w:ilvl="5" w:tplc="18090005" w:tentative="1">
+      <w:start w:val="1"/>
+      <w:numFmt w:val="bullet"/>
+      <w:lvlText w:val=""/>
+      <w:lvlJc w:val="left"/>
+      <w:pPr>
+        <w:ind w:left="5040" w:hanging="360"/>
+      </w:pPr>
+      <w:rPr>
+        <w:rFonts w:ascii="Wingdings" w:hAnsi="Wingdings" w:hint="default"/>
+      </w:rPr>
+    </w:lvl>
+    <w:lvl w:ilvl="6" w:tplc="18090001" w:tentative="1">
+      <w:start w:val="1"/>
+      <w:numFmt w:val="bullet"/>
+      <w:lvlText w:val=""/>
+      <w:lvlJc w:val="left"/>
+      <w:pPr>
+        <w:ind w:left="5760" w:hanging="360"/>
+      </w:pPr>
+      <w:rPr>
+        <w:rFonts w:ascii="Symbol" w:hAnsi="Symbol" w:hint="default"/>
+      </w:rPr>
+    </w:lvl>
+    <w:lvl w:ilvl="7" w:tplc="18090003" w:tentative="1">
+      <w:start w:val="1"/>
+      <w:numFmt w:val="bullet"/>
+      <w:lvlText w:val="o"/>
+      <w:lvlJc w:val="left"/>
+      <w:pPr>
+        <w:ind w:left="6480" w:hanging="360"/>
+      </w:pPr>
+      <w:rPr>
+        <w:rFonts w:ascii="Courier New" w:hAnsi="Courier New" w:cs="Courier New" w:hint="default"/>
+      </w:rPr>
+    </w:lvl>
+    <w:lvl w:ilvl="8" w:tplc="18090005" w:tentative="1">
+      <w:start w:val="1"/>
+      <w:numFmt w:val="bullet"/>
+      <w:lvlText w:val=""/>
+      <w:lvlJc w:val="left"/>
+      <w:pPr>
+        <w:ind w:left="7200" w:hanging="360"/>
+      </w:pPr>
+      <w:rPr>
+        <w:rFonts w:ascii="Wingdings" w:hAnsi="Wingdings" w:hint="default"/>
+      </w:rPr>
+    </w:lvl>
+  </w:abstractNum>
+  <w:abstractNum w:abstractNumId="13" w15:restartNumberingAfterBreak="0">
+    <w:nsid w:val="76EF763C"/>
+    <w:multiLevelType w:val="hybridMultilevel"/>
+    <w:tmpl w:val="875086A2"/>
+    <w:lvl w:ilvl="0" w:tplc="FFFFFFFF">
+      <w:start w:val="1"/>
+      <w:numFmt w:val="bullet"/>
+      <w:lvlText w:val=""/>
+      <w:lvlJc w:val="left"/>
+      <w:pPr>
+        <w:ind w:left="720" w:hanging="360"/>
+      </w:pPr>
+      <w:rPr>
+        <w:rFonts w:ascii="Symbol" w:hAnsi="Symbol" w:hint="default"/>
+      </w:rPr>
+    </w:lvl>
+    <w:lvl w:ilvl="1" w:tplc="18090009">
+      <w:start w:val="1"/>
+      <w:numFmt w:val="bullet"/>
+      <w:lvlText w:val=""/>
+      <w:lvlJc w:val="left"/>
+      <w:pPr>
+        <w:ind w:left="1440" w:hanging="360"/>
+      </w:pPr>
+      <w:rPr>
+        <w:rFonts w:ascii="Wingdings" w:hAnsi="Wingdings" w:hint="default"/>
+      </w:rPr>
+    </w:lvl>
+    <w:lvl w:ilvl="2" w:tplc="FFFFFFFF" w:tentative="1">
+      <w:start w:val="1"/>
+      <w:numFmt w:val="bullet"/>
+      <w:lvlText w:val=""/>
+      <w:lvlJc w:val="left"/>
+      <w:pPr>
+        <w:ind w:left="2160" w:hanging="360"/>
+      </w:pPr>
+      <w:rPr>
+        <w:rFonts w:ascii="Wingdings" w:hAnsi="Wingdings" w:hint="default"/>
+      </w:rPr>
+    </w:lvl>
+    <w:lvl w:ilvl="3" w:tplc="FFFFFFFF" w:tentative="1">
+      <w:start w:val="1"/>
+      <w:numFmt w:val="bullet"/>
+      <w:lvlText w:val=""/>
+      <w:lvlJc w:val="left"/>
+      <w:pPr>
+        <w:ind w:left="2880" w:hanging="360"/>
+      </w:pPr>
+      <w:rPr>
+        <w:rFonts w:ascii="Symbol" w:hAnsi="Symbol" w:hint="default"/>
+      </w:rPr>
+    </w:lvl>
+    <w:lvl w:ilvl="4" w:tplc="FFFFFFFF" w:tentative="1">
+      <w:start w:val="1"/>
+      <w:numFmt w:val="bullet"/>
+      <w:lvlText w:val="o"/>
+      <w:lvlJc w:val="left"/>
+      <w:pPr>
+        <w:ind w:left="3600" w:hanging="360"/>
+      </w:pPr>
+      <w:rPr>
+        <w:rFonts w:ascii="Courier New" w:hAnsi="Courier New" w:cs="Courier New" w:hint="default"/>
+      </w:rPr>
+    </w:lvl>
+    <w:lvl w:ilvl="5" w:tplc="FFFFFFFF" w:tentative="1">
+      <w:start w:val="1"/>
+      <w:numFmt w:val="bullet"/>
+      <w:lvlText w:val=""/>
+      <w:lvlJc w:val="left"/>
+      <w:pPr>
+        <w:ind w:left="4320" w:hanging="360"/>
+      </w:pPr>
+      <w:rPr>
+        <w:rFonts w:ascii="Wingdings" w:hAnsi="Wingdings" w:hint="default"/>
+      </w:rPr>
+    </w:lvl>
+    <w:lvl w:ilvl="6" w:tplc="FFFFFFFF" w:tentative="1">
+      <w:start w:val="1"/>
+      <w:numFmt w:val="bullet"/>
+      <w:lvlText w:val=""/>
+      <w:lvlJc w:val="left"/>
+      <w:pPr>
+        <w:ind w:left="5040" w:hanging="360"/>
+      </w:pPr>
+      <w:rPr>
+        <w:rFonts w:ascii="Symbol" w:hAnsi="Symbol" w:hint="default"/>
+      </w:rPr>
+    </w:lvl>
+    <w:lvl w:ilvl="7" w:tplc="FFFFFFFF" w:tentative="1">
+      <w:start w:val="1"/>
+      <w:numFmt w:val="bullet"/>
+      <w:lvlText w:val="o"/>
+      <w:lvlJc w:val="left"/>
+      <w:pPr>
+        <w:ind w:left="5760" w:hanging="360"/>
+      </w:pPr>
+      <w:rPr>
+        <w:rFonts w:ascii="Courier New" w:hAnsi="Courier New" w:cs="Courier New" w:hint="default"/>
+      </w:rPr>
+    </w:lvl>
+    <w:lvl w:ilvl="8" w:tplc="FFFFFFFF" w:tentative="1">
+      <w:start w:val="1"/>
+      <w:numFmt w:val="bullet"/>
+      <w:lvlText w:val=""/>
+      <w:lvlJc w:val="left"/>
+      <w:pPr>
+        <w:ind w:left="6480" w:hanging="360"/>
+      </w:pPr>
+      <w:rPr>
+        <w:rFonts w:ascii="Wingdings" w:hAnsi="Wingdings" w:hint="default"/>
+      </w:rPr>
+    </w:lvl>
+  </w:abstractNum>
+  <w:abstractNum w:abstractNumId="14" w15:restartNumberingAfterBreak="0">
     <w:nsid w:val="7D086A50"/>
     <w:multiLevelType w:val="hybridMultilevel"/>
     <w:tmpl w:val="8E224272"/>
@@ -7840,25 +10622,49 @@
     </w:lvl>
   </w:abstractNum>
   <w:num w:numId="1" w16cid:durableId="1023018737">
+    <w:abstractNumId w:val="6"/>
+  </w:num>
+  <w:num w:numId="2" w16cid:durableId="564335785">
+    <w:abstractNumId w:val="11"/>
+  </w:num>
+  <w:num w:numId="3" w16cid:durableId="478614472">
+    <w:abstractNumId w:val="2"/>
+  </w:num>
+  <w:num w:numId="4" w16cid:durableId="754934149">
+    <w:abstractNumId w:val="1"/>
+  </w:num>
+  <w:num w:numId="5" w16cid:durableId="1299185876">
+    <w:abstractNumId w:val="14"/>
+  </w:num>
+  <w:num w:numId="6" w16cid:durableId="1740320845">
     <w:abstractNumId w:val="3"/>
   </w:num>
-  <w:num w:numId="2" w16cid:durableId="564335785">
+  <w:num w:numId="7" w16cid:durableId="1811434058">
+    <w:abstractNumId w:val="8"/>
+  </w:num>
+  <w:num w:numId="8" w16cid:durableId="64648487">
     <w:abstractNumId w:val="5"/>
   </w:num>
-  <w:num w:numId="3" w16cid:durableId="478614472">
-    <w:abstractNumId w:val="1"/>
+  <w:num w:numId="9" w16cid:durableId="20975894">
+    <w:abstractNumId w:val="7"/>
   </w:num>
-  <w:num w:numId="4" w16cid:durableId="754934149">
+  <w:num w:numId="10" w16cid:durableId="1729576032">
+    <w:abstractNumId w:val="12"/>
+  </w:num>
+  <w:num w:numId="11" w16cid:durableId="2041852725">
+    <w:abstractNumId w:val="4"/>
+  </w:num>
+  <w:num w:numId="12" w16cid:durableId="598029866">
+    <w:abstractNumId w:val="9"/>
+  </w:num>
+  <w:num w:numId="13" w16cid:durableId="1648044550">
     <w:abstractNumId w:val="0"/>
   </w:num>
-  <w:num w:numId="5" w16cid:durableId="1299185876">
-    <w:abstractNumId w:val="6"/>
+  <w:num w:numId="14" w16cid:durableId="419528541">
+    <w:abstractNumId w:val="10"/>
   </w:num>
-  <w:num w:numId="6" w16cid:durableId="1740320845">
-    <w:abstractNumId w:val="2"/>
-  </w:num>
-  <w:num w:numId="7" w16cid:durableId="1811434058">
-    <w:abstractNumId w:val="4"/>
+  <w:num w:numId="15" w16cid:durableId="678124314">
+    <w:abstractNumId w:val="13"/>
   </w:num>
 </w:numbering>
 </file>
@@ -8386,7 +11192,6 @@
   <w:style w:type="character" w:default="1" w:styleId="DefaultParagraphFont">
     <w:name w:val="Default Paragraph Font"/>
     <w:uiPriority w:val="1"/>
-    <w:semiHidden/>
     <w:unhideWhenUsed/>
   </w:style>
   <w:style w:type="table" w:default="1" w:styleId="TableNormal">

</xml_diff>